<commit_message>
api type & animation css
</commit_message>
<xml_diff>
--- a/doc/Base-US + Update.docx
+++ b/doc/Base-US + Update.docx
@@ -33,8 +33,11 @@
       </w:r>
     </w:p>
     <w:p>
-      <w:r>
-        <w:t>CineHub là một ứng dụng web phim hiện đại cho phép người dùng duyệt, tìm kiếm và khám phá phim sử dụng TMDB API. Ứng dụng cung cấp trải nghiệm người dùng mượt mà với thiết kế hiện đại giống Netflix, hỗ trợ xác thực, danh sách phim cá nhân hóa và thông tin phim chi tiết.</w:t>
+      <w:pPr>
+        <w:jc w:val="both"/>
+      </w:pPr>
+      <w:r>
+        <w:t>CineHub là một ứng dụng web xem phim hiện đại, cho phép người dùng duyệt, tìm kiếm và khám phá phim thông qua API của TMDB. Ứng dụng mang đến trải nghiệm người dùng mượt mà với giao diện hiện đại tương tự Netflix, hỗ trợ xác thực, tạo danh sách phim cá nhân hóa và cung cấp thông tin chi tiết về phim.</w:t>
       </w:r>
     </w:p>
     <w:p>
@@ -85,6 +88,13 @@
         <w:t>Ngôn Ngữ</w:t>
       </w:r>
       <w:r>
+        <w:rPr>
+          <w:b/>
+          <w:bCs/>
+        </w:rPr>
+        <w:t xml:space="preserve"> Lập Trình</w:t>
+      </w:r>
+      <w:r>
         <w:t>: TypeScript</w:t>
       </w:r>
     </w:p>
@@ -139,7 +149,13 @@
         <w:t>Xác Thực</w:t>
       </w:r>
       <w:r>
-        <w:t>: NextAuth.js với JWT + Firebase (Google Auth)</w:t>
+        <w:t>: NextAuth.js với JWT + Firebase (Google Auth</w:t>
+      </w:r>
+      <w:r>
+        <w:t>, Facebook Auth</w:t>
+      </w:r>
+      <w:r>
+        <w:t>)</w:t>
       </w:r>
     </w:p>
     <w:p>
@@ -157,7 +173,16 @@
         <w:t>Database</w:t>
       </w:r>
       <w:r>
-        <w:t>: MySQL (cho user data) + Firebase (Google auth)</w:t>
+        <w:t>: MySQL (cho user data) + Firebase (Google auth</w:t>
+      </w:r>
+      <w:r>
+        <w:t xml:space="preserve">, </w:t>
+      </w:r>
+      <w:r>
+        <w:t>Facebook Auth</w:t>
+      </w:r>
+      <w:r>
+        <w:t>)</w:t>
       </w:r>
     </w:p>
     <w:p>
@@ -216,6 +241,27 @@
     </w:p>
     <w:p>
       <w:pPr>
+        <w:numPr>
+          <w:ilvl w:val="0"/>
+          <w:numId w:val="62"/>
+        </w:numPr>
+      </w:pPr>
+      <w:r>
+        <w:rPr>
+          <w:b/>
+          <w:bCs/>
+        </w:rPr>
+        <w:t xml:space="preserve">Ngôn ngữ </w:t>
+      </w:r>
+      <w:r>
+        <w:t xml:space="preserve">: </w:t>
+      </w:r>
+      <w:r>
+        <w:t>Tiếng Việt</w:t>
+      </w:r>
+    </w:p>
+    <w:p>
+      <w:pPr>
         <w:rPr>
           <w:b/>
           <w:bCs/>
@@ -385,11 +431,28 @@
           <w:bCs/>
         </w:rPr>
       </w:pPr>
-      <w:r>
-        <w:rPr>
-          <w:b/>
-          <w:bCs/>
-        </w:rPr>
+    </w:p>
+    <w:p>
+      <w:pPr>
+        <w:rPr>
+          <w:b/>
+          <w:bCs/>
+        </w:rPr>
+      </w:pPr>
+    </w:p>
+    <w:p>
+      <w:pPr>
+        <w:rPr>
+          <w:b/>
+          <w:bCs/>
+        </w:rPr>
+      </w:pPr>
+      <w:r>
+        <w:rPr>
+          <w:b/>
+          <w:bCs/>
+        </w:rPr>
+        <w:lastRenderedPageBreak/>
         <w:t>US-02: Đăng Nhập Người Dùng</w:t>
       </w:r>
     </w:p>
@@ -448,7 +511,6 @@
         </w:numPr>
       </w:pPr>
       <w:r>
-        <w:lastRenderedPageBreak/>
         <w:t>Người dùng có thể đăng nhập bằng email và mật khẩu đã đăng ký</w:t>
       </w:r>
     </w:p>
@@ -515,7 +577,27 @@
         </w:numPr>
       </w:pPr>
       <w:r>
-        <w:t>Redirect về trang trước đó nếu user đã cố gắng truy cập sidebar trước khi đăng nhập</w:t>
+        <w:t>Hiển thị thông báo phải đăng nhập</w:t>
+      </w:r>
+      <w:r>
+        <w:t xml:space="preserve"> nếu user đã cố gắng truy cập</w:t>
+      </w:r>
+      <w:r>
+        <w:t xml:space="preserve"> các chức năng cần đăng nhập trên</w:t>
+      </w:r>
+      <w:r>
+        <w:t xml:space="preserve"> sidebar</w:t>
+      </w:r>
+    </w:p>
+    <w:p>
+      <w:pPr>
+        <w:numPr>
+          <w:ilvl w:val="0"/>
+          <w:numId w:val="64"/>
+        </w:numPr>
+      </w:pPr>
+      <w:r>
+        <w:t>Ghi nhớ đăng nhập trong 30 ngày (optional)</w:t>
       </w:r>
     </w:p>
     <w:p>
@@ -637,17 +719,216 @@
     </w:p>
     <w:p>
       <w:pPr>
-        <w:rPr>
-          <w:b/>
-          <w:bCs/>
-        </w:rPr>
-      </w:pPr>
-      <w:r>
-        <w:rPr>
-          <w:b/>
-          <w:bCs/>
-        </w:rPr>
-        <w:t>US-04: Đăng Xuất Người Dùng</w:t>
+        <w:numPr>
+          <w:ilvl w:val="0"/>
+          <w:numId w:val="65"/>
+        </w:numPr>
+      </w:pPr>
+      <w:r>
+        <w:t>Xử lý trường hợp Google account đã được liên kết với email khác</w:t>
+      </w:r>
+    </w:p>
+    <w:p>
+      <w:pPr>
+        <w:rPr>
+          <w:b/>
+          <w:bCs/>
+        </w:rPr>
+      </w:pPr>
+      <w:r>
+        <w:rPr>
+          <w:b/>
+          <w:bCs/>
+        </w:rPr>
+        <w:t>US-0</w:t>
+      </w:r>
+      <w:r>
+        <w:rPr>
+          <w:b/>
+          <w:bCs/>
+        </w:rPr>
+        <w:t>4</w:t>
+      </w:r>
+      <w:r>
+        <w:rPr>
+          <w:b/>
+          <w:bCs/>
+        </w:rPr>
+        <w:t xml:space="preserve">: Xác Thực Qua </w:t>
+      </w:r>
+      <w:r>
+        <w:rPr>
+          <w:b/>
+          <w:bCs/>
+        </w:rPr>
+        <w:t>Facebook</w:t>
+      </w:r>
+    </w:p>
+    <w:p>
+      <w:r>
+        <w:rPr>
+          <w:b/>
+          <w:bCs/>
+        </w:rPr>
+        <w:t>Là</w:t>
+      </w:r>
+      <w:r>
+        <w:t xml:space="preserve"> một người dùng,</w:t>
+      </w:r>
+      <w:r>
+        <w:br/>
+      </w:r>
+      <w:r>
+        <w:rPr>
+          <w:b/>
+          <w:bCs/>
+        </w:rPr>
+        <w:t>Tôi muốn</w:t>
+      </w:r>
+      <w:r>
+        <w:t xml:space="preserve"> đăng nhập bằng tài khoản </w:t>
+      </w:r>
+      <w:r>
+        <w:t>Facebook</w:t>
+      </w:r>
+      <w:r>
+        <w:t xml:space="preserve"> của mình,</w:t>
+      </w:r>
+      <w:r>
+        <w:br/>
+      </w:r>
+      <w:r>
+        <w:rPr>
+          <w:b/>
+          <w:bCs/>
+        </w:rPr>
+        <w:t>Để</w:t>
+      </w:r>
+      <w:r>
+        <w:t xml:space="preserve"> có thể truy cập ứng dụng nhanh chóng mà không cần tạo tài khoản mới.</w:t>
+      </w:r>
+    </w:p>
+    <w:p>
+      <w:r>
+        <w:rPr>
+          <w:b/>
+          <w:bCs/>
+        </w:rPr>
+        <w:t>Tiêu Chí Chấp Nhận:</w:t>
+      </w:r>
+    </w:p>
+    <w:p>
+      <w:pPr>
+        <w:numPr>
+          <w:ilvl w:val="0"/>
+          <w:numId w:val="65"/>
+        </w:numPr>
+      </w:pPr>
+      <w:r>
+        <w:t xml:space="preserve">Nút đăng nhập </w:t>
+      </w:r>
+      <w:r>
+        <w:t>Facebook</w:t>
+      </w:r>
+      <w:r>
+        <w:t xml:space="preserve"> được hiển thị nổi bật với styling phù hợp BRD</w:t>
+      </w:r>
+    </w:p>
+    <w:p>
+      <w:pPr>
+        <w:numPr>
+          <w:ilvl w:val="0"/>
+          <w:numId w:val="65"/>
+        </w:numPr>
+      </w:pPr>
+      <w:r>
+        <w:t xml:space="preserve">Sử dụng Firebase Authentication cho </w:t>
+      </w:r>
+      <w:r>
+        <w:t>Facebook</w:t>
+      </w:r>
+      <w:r>
+        <w:t xml:space="preserve"> Auth</w:t>
+      </w:r>
+    </w:p>
+    <w:p>
+      <w:pPr>
+        <w:numPr>
+          <w:ilvl w:val="0"/>
+          <w:numId w:val="65"/>
+        </w:numPr>
+      </w:pPr>
+      <w:r>
+        <w:t>Tích hợp với NextAuth.js để xử lý session</w:t>
+      </w:r>
+    </w:p>
+    <w:p>
+      <w:pPr>
+        <w:numPr>
+          <w:ilvl w:val="0"/>
+          <w:numId w:val="65"/>
+        </w:numPr>
+      </w:pPr>
+      <w:r>
+        <w:t xml:space="preserve">Thông tin </w:t>
+      </w:r>
+      <w:r>
+        <w:t>Facebook</w:t>
+      </w:r>
+      <w:r>
+        <w:t xml:space="preserve"> profile được sử dụng để tạo hoặc link với tài khoản CineHub</w:t>
+      </w:r>
+    </w:p>
+    <w:p>
+      <w:pPr>
+        <w:numPr>
+          <w:ilvl w:val="0"/>
+          <w:numId w:val="65"/>
+        </w:numPr>
+      </w:pPr>
+      <w:r>
+        <w:lastRenderedPageBreak/>
+        <w:t>Người dùng được chuyển hướng đến trang chủ sau khi xác thực thành công</w:t>
+      </w:r>
+    </w:p>
+    <w:p>
+      <w:pPr>
+        <w:numPr>
+          <w:ilvl w:val="0"/>
+          <w:numId w:val="65"/>
+        </w:numPr>
+      </w:pPr>
+      <w:r>
+        <w:t>Xử lý trường hợp Facebook account đã được liên kết với email khác</w:t>
+      </w:r>
+    </w:p>
+    <w:p>
+      <w:pPr>
+        <w:rPr>
+          <w:b/>
+          <w:bCs/>
+        </w:rPr>
+      </w:pPr>
+      <w:r>
+        <w:rPr>
+          <w:b/>
+          <w:bCs/>
+        </w:rPr>
+        <w:t>US-0</w:t>
+      </w:r>
+      <w:r>
+        <w:rPr>
+          <w:b/>
+          <w:bCs/>
+        </w:rPr>
+        <w:t>5</w:t>
+      </w:r>
+      <w:r>
+        <w:rPr>
+          <w:b/>
+          <w:bCs/>
+        </w:rPr>
+        <w:t>: Đăng Xuất Người Dùng</w:t>
       </w:r>
     </w:p>
     <w:p>
@@ -754,17 +1035,56 @@
     </w:p>
     <w:p>
       <w:pPr>
-        <w:rPr>
-          <w:b/>
-          <w:bCs/>
-        </w:rPr>
-      </w:pPr>
-      <w:r>
-        <w:rPr>
-          <w:b/>
-          <w:bCs/>
-        </w:rPr>
-        <w:t>US-05: Quản Lý Hồ Sơ Người Dùng (Cơ Bản)</w:t>
+        <w:numPr>
+          <w:ilvl w:val="0"/>
+          <w:numId w:val="66"/>
+        </w:numPr>
+      </w:pPr>
+      <w:r>
+        <w:t>Xác nhận đăng xuất để tránh việc đăng xuất nhầm</w:t>
+      </w:r>
+    </w:p>
+    <w:p>
+      <w:pPr>
+        <w:rPr>
+          <w:b/>
+          <w:bCs/>
+        </w:rPr>
+      </w:pPr>
+      <w:r>
+        <w:rPr>
+          <w:b/>
+          <w:bCs/>
+        </w:rPr>
+        <w:t>US-0</w:t>
+      </w:r>
+      <w:r>
+        <w:rPr>
+          <w:b/>
+          <w:bCs/>
+        </w:rPr>
+        <w:t>6</w:t>
+      </w:r>
+      <w:r>
+        <w:rPr>
+          <w:b/>
+          <w:bCs/>
+        </w:rPr>
+        <w:t>: Quản Lý Người Dùng</w:t>
+      </w:r>
+      <w:r>
+        <w:rPr>
+          <w:b/>
+          <w:bCs/>
+        </w:rPr>
+        <w:t xml:space="preserve"> (Admin</w:t>
+      </w:r>
+      <w:r>
+        <w:rPr>
+          <w:b/>
+          <w:bCs/>
+        </w:rPr>
+        <w:t>)</w:t>
       </w:r>
     </w:p>
     <w:p>
@@ -776,7 +1096,13 @@
         <w:t>Là</w:t>
       </w:r>
       <w:r>
-        <w:t xml:space="preserve"> một người dùng đã đăng ký,</w:t>
+        <w:t xml:space="preserve"> một </w:t>
+      </w:r>
+      <w:r>
+        <w:t>quản trị viên (Admin)</w:t>
+      </w:r>
+      <w:r>
+        <w:t>,</w:t>
       </w:r>
       <w:r>
         <w:br/>
@@ -789,7 +1115,13 @@
         <w:t>Tôi muốn</w:t>
       </w:r>
       <w:r>
-        <w:t xml:space="preserve"> cập nhật thông tin cơ bản của mình,</w:t>
+        <w:t xml:space="preserve"> quản lý người dùng </w:t>
+      </w:r>
+      <w:r>
+        <w:t>và theo dõi hệ thống</w:t>
+      </w:r>
+      <w:r>
+        <w:t>,</w:t>
       </w:r>
       <w:r>
         <w:br/>
@@ -802,7 +1134,13 @@
         <w:t>Để</w:t>
       </w:r>
       <w:r>
-        <w:t xml:space="preserve"> tài khoản của tôi được cập nhật.</w:t>
+        <w:t xml:space="preserve"> </w:t>
+      </w:r>
+      <w:r>
+        <w:t>đảm bảo tài khoản và quyền hạn của người dùng được cập nhật chính xác</w:t>
+      </w:r>
+      <w:r>
+        <w:t>.</w:t>
       </w:r>
     </w:p>
     <w:p>
@@ -822,7 +1160,7 @@
         </w:numPr>
       </w:pPr>
       <w:r>
-        <w:t>Người dùng có thể cập nhật tên hiển thị và email</w:t>
+        <w:t>Admin có thể xem, tìm kiếm, tên/email và đổi mật khẩu cho use (yêu cầu xác minh mật khẩu admin)</w:t>
       </w:r>
     </w:p>
     <w:p>
@@ -833,8 +1171,10 @@
         </w:numPr>
       </w:pPr>
       <w:r>
-        <w:lastRenderedPageBreak/>
-        <w:t>Thay đổi mật khẩu yêu cầu xác minh mật khẩu hiện tại</w:t>
+        <w:t xml:space="preserve">Admin có thể phân quyền cho user </w:t>
+      </w:r>
+      <w:r>
+        <w:t>theo cấp bậc tăng dần (chỉ có 1 admin): User =&gt; Moderator =&gt; Admin</w:t>
       </w:r>
     </w:p>
     <w:p>
@@ -847,6 +1187,12 @@
       <w:r>
         <w:t>Các thay đổi được lưu vào MySQL database</w:t>
       </w:r>
+      <w:r>
+        <w:t xml:space="preserve">. </w:t>
+      </w:r>
+      <w:r>
+        <w:t>Thông báo thành công/lỗi được hiển thị với màu sắc phù hợp BRD</w:t>
+      </w:r>
     </w:p>
     <w:p>
       <w:pPr>
@@ -856,7 +1202,10 @@
         </w:numPr>
       </w:pPr>
       <w:r>
-        <w:t>Thông báo thành công/lỗi được hiển thị với màu sắc phù hợp BRD</w:t>
+        <w:t>Admin và Moderator có thể tải ảnh lên để người dùng lựa chọn làm hình đại diện.</w:t>
+      </w:r>
+      <w:r>
+        <w:t xml:space="preserve"> </w:t>
       </w:r>
     </w:p>
     <w:p>
@@ -867,7 +1216,219 @@
         </w:numPr>
       </w:pPr>
       <w:r>
-        <w:t>Giao diện đơn giản, không phức tạp về upload avatar</w:t>
+        <w:t>Giao diện dashboard cho admin hiển thị biểu đồ lượt truy cập và thông tin cơ bản của user</w:t>
+      </w:r>
+      <w:r>
+        <w:t xml:space="preserve">. </w:t>
+      </w:r>
+    </w:p>
+    <w:p>
+      <w:pPr>
+        <w:numPr>
+          <w:ilvl w:val="0"/>
+          <w:numId w:val="67"/>
+        </w:numPr>
+      </w:pPr>
+      <w:r>
+        <w:t>Giao diện thiết kế đơn giản, dễ sử dụng, không bao gồm các chức năng phức tạp</w:t>
+      </w:r>
+    </w:p>
+    <w:p>
+      <w:pPr>
+        <w:numPr>
+          <w:ilvl w:val="0"/>
+          <w:numId w:val="67"/>
+        </w:numPr>
+      </w:pPr>
+      <w:r>
+        <w:t>Khả năng vô hiệu hóa/kích hoạt tài khoản user</w:t>
+      </w:r>
+      <w:r>
+        <w:t xml:space="preserve"> (extra)</w:t>
+      </w:r>
+    </w:p>
+    <w:p>
+      <w:pPr>
+        <w:numPr>
+          <w:ilvl w:val="0"/>
+          <w:numId w:val="67"/>
+        </w:numPr>
+      </w:pPr>
+      <w:r>
+        <w:t>Log hoạt động admin để theo dõi các thay đổi</w:t>
+      </w:r>
+      <w:r>
+        <w:t xml:space="preserve"> (</w:t>
+      </w:r>
+      <w:r>
+        <w:t>extra)</w:t>
+      </w:r>
+    </w:p>
+    <w:p>
+      <w:pPr>
+        <w:rPr>
+          <w:b/>
+          <w:bCs/>
+        </w:rPr>
+      </w:pPr>
+      <w:r>
+        <w:rPr>
+          <w:b/>
+          <w:bCs/>
+        </w:rPr>
+        <w:t>US-0</w:t>
+      </w:r>
+      <w:r>
+        <w:rPr>
+          <w:b/>
+          <w:bCs/>
+        </w:rPr>
+        <w:t>7</w:t>
+      </w:r>
+      <w:r>
+        <w:rPr>
+          <w:b/>
+          <w:bCs/>
+        </w:rPr>
+        <w:t>: Quản Lý Hồ Sơ Người Dùng (Cơ Bản)</w:t>
+      </w:r>
+    </w:p>
+    <w:p>
+      <w:r>
+        <w:rPr>
+          <w:b/>
+          <w:bCs/>
+        </w:rPr>
+        <w:t>Là</w:t>
+      </w:r>
+      <w:r>
+        <w:t xml:space="preserve"> một người dùng đã đăng ký,</w:t>
+      </w:r>
+      <w:r>
+        <w:br/>
+      </w:r>
+      <w:r>
+        <w:rPr>
+          <w:b/>
+          <w:bCs/>
+        </w:rPr>
+        <w:t>Tôi muốn</w:t>
+      </w:r>
+      <w:r>
+        <w:t xml:space="preserve"> cập nhật thông tin cơ bản của mình,</w:t>
+      </w:r>
+      <w:r>
+        <w:br/>
+      </w:r>
+      <w:r>
+        <w:rPr>
+          <w:b/>
+          <w:bCs/>
+        </w:rPr>
+        <w:t>Để</w:t>
+      </w:r>
+      <w:r>
+        <w:t xml:space="preserve"> tài khoản của tôi được cập nhật.</w:t>
+      </w:r>
+    </w:p>
+    <w:p>
+      <w:r>
+        <w:rPr>
+          <w:b/>
+          <w:bCs/>
+        </w:rPr>
+        <w:t>Tiêu Chí Chấp Nhận:</w:t>
+      </w:r>
+    </w:p>
+    <w:p>
+      <w:pPr>
+        <w:numPr>
+          <w:ilvl w:val="0"/>
+          <w:numId w:val="67"/>
+        </w:numPr>
+      </w:pPr>
+      <w:r>
+        <w:lastRenderedPageBreak/>
+        <w:t>Người dùng có thể cập nhật tên hiển thị và email</w:t>
+      </w:r>
+    </w:p>
+    <w:p>
+      <w:pPr>
+        <w:numPr>
+          <w:ilvl w:val="0"/>
+          <w:numId w:val="67"/>
+        </w:numPr>
+      </w:pPr>
+      <w:r>
+        <w:t>Thay đổi mật khẩu yêu cầu xác minh mật khẩu hiện tại</w:t>
+      </w:r>
+    </w:p>
+    <w:p>
+      <w:pPr>
+        <w:numPr>
+          <w:ilvl w:val="0"/>
+          <w:numId w:val="67"/>
+        </w:numPr>
+      </w:pPr>
+      <w:r>
+        <w:t>Các thay đổi được lưu vào MySQL database</w:t>
+      </w:r>
+    </w:p>
+    <w:p>
+      <w:pPr>
+        <w:numPr>
+          <w:ilvl w:val="0"/>
+          <w:numId w:val="67"/>
+        </w:numPr>
+      </w:pPr>
+      <w:r>
+        <w:t>Thông báo thành công/lỗi được hiển thị với màu sắc phù hợp BRD</w:t>
+      </w:r>
+    </w:p>
+    <w:p>
+      <w:pPr>
+        <w:numPr>
+          <w:ilvl w:val="0"/>
+          <w:numId w:val="67"/>
+        </w:numPr>
+      </w:pPr>
+      <w:r>
+        <w:t>Người dùng có thể chọn các hình đại diện có sẵn được admin và moderator tải lên.</w:t>
+      </w:r>
+      <w:r>
+        <w:rPr>
+          <w:b/>
+          <w:bCs/>
+        </w:rPr>
+        <w:t xml:space="preserve"> </w:t>
+      </w:r>
+    </w:p>
+    <w:p>
+      <w:pPr>
+        <w:numPr>
+          <w:ilvl w:val="0"/>
+          <w:numId w:val="67"/>
+        </w:numPr>
+      </w:pPr>
+      <w:r>
+        <w:t xml:space="preserve">Xác thực email mới trước khi cập nhật (nếu thay đổi email) </w:t>
+      </w:r>
+      <w:r>
+        <w:t>(optional)</w:t>
+      </w:r>
+    </w:p>
+    <w:p>
+      <w:pPr>
+        <w:numPr>
+          <w:ilvl w:val="0"/>
+          <w:numId w:val="67"/>
+        </w:numPr>
+      </w:pPr>
+      <w:r>
+        <w:t>Tùy chọn xóa tài khoản với xác nhận bảo mật</w:t>
+      </w:r>
+      <w:r>
+        <w:t xml:space="preserve"> (optional)</w:t>
       </w:r>
     </w:p>
     <w:p>
@@ -897,7 +1458,21 @@
           <w:b/>
           <w:bCs/>
         </w:rPr>
-        <w:t>US-06: Duyệt Phim Từ TMDB</w:t>
+        <w:t>US-0</w:t>
+      </w:r>
+      <w:r>
+        <w:rPr>
+          <w:b/>
+          <w:bCs/>
+        </w:rPr>
+        <w:t>8</w:t>
+      </w:r>
+      <w:r>
+        <w:rPr>
+          <w:b/>
+          <w:bCs/>
+        </w:rPr>
+        <w:t>: Duyệt Phim Từ TMDB</w:t>
       </w:r>
     </w:p>
     <w:p>
@@ -966,7 +1541,10 @@
         </w:numPr>
       </w:pPr>
       <w:r>
-        <w:t>Phim được hiển thị theo các category: Popular, Top Rated, Now Playing, Upcoming</w:t>
+        <w:t xml:space="preserve">Phim được hiển thị theo các category: </w:t>
+      </w:r>
+      <w:r>
+        <w:t>Phổ biến (Popular), Được đánh giá cao nhất (Top Rated), Đang chiếu (Now Playing), Sắp chiếu (Upcoming).</w:t>
       </w:r>
     </w:p>
     <w:p>
@@ -999,7 +1577,10 @@
         </w:numPr>
       </w:pPr>
       <w:r>
-        <w:t>Implement infinite scroll hoặc pagination để load thêm phim</w:t>
+        <w:t>Implement infinite scroll để load thêm phim</w:t>
+      </w:r>
+      <w:r>
+        <w:t xml:space="preserve"> và mỗi category hiển thị 10 phim sau khi đến phim thứ 10 thì quay về phim thứ nhất</w:t>
       </w:r>
     </w:p>
     <w:p>
@@ -1010,22 +1591,39 @@
         </w:numPr>
       </w:pPr>
       <w:r>
-        <w:t>Styling theo design system đã định nghĩa trong BRD</w:t>
-      </w:r>
-    </w:p>
-    <w:p>
-      <w:pPr>
-        <w:rPr>
-          <w:b/>
-          <w:bCs/>
-        </w:rPr>
-      </w:pPr>
-      <w:r>
-        <w:rPr>
-          <w:b/>
-          <w:bCs/>
-        </w:rPr>
-        <w:t>US-07: Tìm Kiếm Phim</w:t>
+        <w:t>Thiết kế theo mãu trong</w:t>
+      </w:r>
+      <w:r>
+        <w:t xml:space="preserve"> BRD</w:t>
+      </w:r>
+    </w:p>
+    <w:p>
+      <w:pPr>
+        <w:rPr>
+          <w:b/>
+          <w:bCs/>
+        </w:rPr>
+      </w:pPr>
+      <w:r>
+        <w:rPr>
+          <w:b/>
+          <w:bCs/>
+        </w:rPr>
+        <w:t>US-0</w:t>
+      </w:r>
+      <w:r>
+        <w:rPr>
+          <w:b/>
+          <w:bCs/>
+        </w:rPr>
+        <w:t>9</w:t>
+      </w:r>
+      <w:r>
+        <w:rPr>
+          <w:b/>
+          <w:bCs/>
+        </w:rPr>
+        <w:t>: Tìm Kiếm Phim</w:t>
       </w:r>
     </w:p>
     <w:p>
@@ -1083,7 +1681,13 @@
         </w:numPr>
       </w:pPr>
       <w:r>
-        <w:t>Search bar có thể truy cập từ header/navbar</w:t>
+        <w:t>Search bar có thể truy cập từ header/</w:t>
+      </w:r>
+      <w:r>
+        <w:t>side</w:t>
+      </w:r>
+      <w:r>
+        <w:t>bar</w:t>
       </w:r>
     </w:p>
     <w:p>
@@ -1138,30 +1742,48 @@
         </w:numPr>
       </w:pPr>
       <w:r>
-        <w:t>Search history được lưu cho logged-in users (optional)</w:t>
-      </w:r>
-    </w:p>
-    <w:p>
-      <w:pPr>
-        <w:rPr>
-          <w:b/>
-          <w:bCs/>
-        </w:rPr>
-      </w:pPr>
-      <w:r>
-        <w:rPr>
-          <w:b/>
-          <w:bCs/>
-        </w:rPr>
-        <w:t>US-08: Xem Chi Tiết Phim (Movie Detail)</w:t>
-      </w:r>
-    </w:p>
-    <w:p>
-      <w:r>
-        <w:rPr>
-          <w:b/>
-          <w:bCs/>
-        </w:rPr>
+        <w:t xml:space="preserve">Search history được lưu cho </w:t>
+      </w:r>
+      <w:r>
+        <w:t>user đã đăng nhập</w:t>
+      </w:r>
+    </w:p>
+    <w:p>
+      <w:pPr>
+        <w:rPr>
+          <w:b/>
+          <w:bCs/>
+        </w:rPr>
+      </w:pPr>
+      <w:r>
+        <w:rPr>
+          <w:b/>
+          <w:bCs/>
+        </w:rPr>
+        <w:t>US-</w:t>
+      </w:r>
+      <w:r>
+        <w:rPr>
+          <w:b/>
+          <w:bCs/>
+        </w:rPr>
+        <w:t>10</w:t>
+      </w:r>
+      <w:r>
+        <w:rPr>
+          <w:b/>
+          <w:bCs/>
+        </w:rPr>
+        <w:t>: Xem Chi Tiết Phim (Movie Detail)</w:t>
+      </w:r>
+    </w:p>
+    <w:p>
+      <w:r>
+        <w:rPr>
+          <w:b/>
+          <w:bCs/>
+        </w:rPr>
+        <w:lastRenderedPageBreak/>
         <w:t xml:space="preserve">Là </w:t>
       </w:r>
       <w:r>
@@ -1229,7 +1851,6 @@
         </w:numPr>
       </w:pPr>
       <w:r>
-        <w:lastRenderedPageBreak/>
         <w:t>Hiển thị: poster, backdrop, title, release date, runtime, genres, rating, overview</w:t>
       </w:r>
     </w:p>
@@ -1340,24 +1961,53 @@
     </w:p>
     <w:p>
       <w:pPr>
-        <w:rPr>
-          <w:b/>
-          <w:bCs/>
-        </w:rPr>
-      </w:pPr>
-      <w:r>
-        <w:rPr>
-          <w:b/>
-          <w:bCs/>
-        </w:rPr>
-        <w:t>US-0</w:t>
-      </w:r>
-      <w:r>
-        <w:rPr>
-          <w:b/>
-          <w:bCs/>
-        </w:rPr>
-        <w:t>9</w:t>
+        <w:numPr>
+          <w:ilvl w:val="0"/>
+          <w:numId w:val="88"/>
+        </w:numPr>
+      </w:pPr>
+      <w:r>
+        <w:t xml:space="preserve">Có nút social share </w:t>
+      </w:r>
+    </w:p>
+    <w:p>
+      <w:pPr>
+        <w:numPr>
+          <w:ilvl w:val="0"/>
+          <w:numId w:val="88"/>
+        </w:numPr>
+      </w:pPr>
+      <w:r>
+        <w:t>Loading states cho từng tab</w:t>
+      </w:r>
+    </w:p>
+    <w:p>
+      <w:pPr>
+        <w:rPr>
+          <w:b/>
+          <w:bCs/>
+        </w:rPr>
+      </w:pPr>
+      <w:r>
+        <w:rPr>
+          <w:b/>
+          <w:bCs/>
+        </w:rPr>
+        <w:t>US-</w:t>
+      </w:r>
+      <w:r>
+        <w:rPr>
+          <w:b/>
+          <w:bCs/>
+        </w:rPr>
+        <w:t>1</w:t>
+      </w:r>
+      <w:r>
+        <w:rPr>
+          <w:b/>
+          <w:bCs/>
+        </w:rPr>
+        <w:t>1</w:t>
       </w:r>
       <w:r>
         <w:rPr>
@@ -1583,6 +2233,26 @@
     </w:p>
     <w:p>
       <w:pPr>
+        <w:numPr>
+          <w:ilvl w:val="0"/>
+          <w:numId w:val="89"/>
+        </w:numPr>
+      </w:pPr>
+      <w:r>
+        <w:t xml:space="preserve">Navigation giữa các </w:t>
+      </w:r>
+      <w:r>
+        <w:t>mùa</w:t>
+      </w:r>
+      <w:r>
+        <w:t xml:space="preserve"> và </w:t>
+      </w:r>
+      <w:r>
+        <w:t>tập</w:t>
+      </w:r>
+    </w:p>
+    <w:p>
+      <w:pPr>
         <w:rPr>
           <w:b/>
           <w:bCs/>
@@ -1600,7 +2270,14 @@
           <w:b/>
           <w:bCs/>
         </w:rPr>
-        <w:t>10</w:t>
+        <w:t>1</w:t>
+      </w:r>
+      <w:r>
+        <w:rPr>
+          <w:b/>
+          <w:bCs/>
+        </w:rPr>
+        <w:t>2</w:t>
       </w:r>
       <w:r>
         <w:rPr>
@@ -1616,6 +2293,7 @@
           <w:b/>
           <w:bCs/>
         </w:rPr>
+        <w:lastRenderedPageBreak/>
         <w:t>Là</w:t>
       </w:r>
       <w:r>
@@ -1676,7 +2354,7 @@
         </w:numPr>
       </w:pPr>
       <w:r>
-        <w:t>Multiple filters có thể được áp dụng đồng thời</w:t>
+        <w:t>Nhiều bộ lọc (Multiple filters) có thể được áp dụng đồng thời</w:t>
       </w:r>
     </w:p>
     <w:p>
@@ -1687,7 +2365,10 @@
         </w:numPr>
       </w:pPr>
       <w:r>
-        <w:t>Visual indicators cho active filters</w:t>
+        <w:t>Hiển thị trực quan các bộ lọc đang hoạt động.</w:t>
+      </w:r>
+      <w:r>
+        <w:t xml:space="preserve"> </w:t>
       </w:r>
     </w:p>
     <w:p>
@@ -1698,7 +2379,7 @@
         </w:numPr>
       </w:pPr>
       <w:r>
-        <w:t>Clear filters option</w:t>
+        <w:t>Xoá bộ lọc (Clear Fillter)</w:t>
       </w:r>
     </w:p>
     <w:p>
@@ -1709,12 +2390,36 @@
         </w:numPr>
       </w:pPr>
       <w:r>
-        <w:lastRenderedPageBreak/>
         <w:t>Filter state được maintain trong session</w:t>
       </w:r>
     </w:p>
     <w:p>
       <w:pPr>
+        <w:numPr>
+          <w:ilvl w:val="0"/>
+          <w:numId w:val="71"/>
+        </w:numPr>
+      </w:pPr>
+      <w:r>
+        <w:t>Tuỳ chọn short</w:t>
+      </w:r>
+      <w:r>
+        <w:t xml:space="preserve"> (popularity, rating, release date)</w:t>
+      </w:r>
+    </w:p>
+    <w:p>
+      <w:pPr>
+        <w:numPr>
+          <w:ilvl w:val="0"/>
+          <w:numId w:val="71"/>
+        </w:numPr>
+      </w:pPr>
+      <w:r>
+        <w:t>Reset về default filters</w:t>
+      </w:r>
+    </w:p>
+    <w:p>
+      <w:pPr>
         <w:rPr>
           <w:b/>
           <w:bCs/>
@@ -1747,7 +2452,7 @@
           <w:b/>
           <w:bCs/>
         </w:rPr>
-        <w:t>1</w:t>
+        <w:t>3</w:t>
       </w:r>
       <w:r>
         <w:rPr>
@@ -1812,7 +2517,16 @@
         </w:numPr>
       </w:pPr>
       <w:r>
-        <w:t>Add to watchlist button trên movie cards và detail pages</w:t>
+        <w:t>Nút “a</w:t>
+      </w:r>
+      <w:r>
+        <w:t>dd to watchlist</w:t>
+      </w:r>
+      <w:r>
+        <w:t>”</w:t>
+      </w:r>
+      <w:r>
+        <w:t xml:space="preserve"> trên movie cards và detail pages</w:t>
       </w:r>
     </w:p>
     <w:p>
@@ -1823,7 +2537,10 @@
         </w:numPr>
       </w:pPr>
       <w:r>
-        <w:t>Visual indicator cho movies đã có trong watchlist</w:t>
+        <w:t>Hiển thị trực quan các phim</w:t>
+      </w:r>
+      <w:r>
+        <w:t xml:space="preserve"> đã có trong watchlist</w:t>
       </w:r>
     </w:p>
     <w:p>
@@ -1834,7 +2551,7 @@
         </w:numPr>
       </w:pPr>
       <w:r>
-        <w:t>Watchlist data được lưu trong MySQL database</w:t>
+        <w:t>Watchlist data được lưu trong MySQL</w:t>
       </w:r>
     </w:p>
     <w:p>
@@ -1845,7 +2562,7 @@
         </w:numPr>
       </w:pPr>
       <w:r>
-        <w:t>Success/error notifications với styling theo BRD</w:t>
+        <w:t>Thông báo thành công/lỗi được hiển thị với màu sắc phù hợp BRD</w:t>
       </w:r>
     </w:p>
     <w:p>
@@ -1856,7 +2573,19 @@
         </w:numPr>
       </w:pPr>
       <w:r>
-        <w:t>Watchlist accessible từ sidebar (chỉ cho logged-in users)</w:t>
+        <w:t xml:space="preserve">Watchlist </w:t>
+      </w:r>
+      <w:r>
+        <w:t>có thể truy cập từ side bar</w:t>
+      </w:r>
+      <w:r>
+        <w:t xml:space="preserve"> (chỉ cho users</w:t>
+      </w:r>
+      <w:r>
+        <w:t xml:space="preserve"> đã đăng nhập</w:t>
+      </w:r>
+      <w:r>
+        <w:t>)</w:t>
       </w:r>
     </w:p>
     <w:p>
@@ -1867,7 +2596,10 @@
         </w:numPr>
       </w:pPr>
       <w:r>
-        <w:t>Sync across devices cho same user</w:t>
+        <w:t>Đồng bộ hóa trên các thiết bị cho cùng một người dùng</w:t>
+      </w:r>
+      <w:r>
+        <w:t xml:space="preserve"> (Optional)</w:t>
       </w:r>
     </w:p>
     <w:p>
@@ -1889,7 +2621,7 @@
           <w:b/>
           <w:bCs/>
         </w:rPr>
-        <w:t>2</w:t>
+        <w:t>4</w:t>
       </w:r>
       <w:r>
         <w:rPr>
@@ -1954,7 +2686,10 @@
         </w:numPr>
       </w:pPr>
       <w:r>
-        <w:t>Simple rating system (1-5 stars hoặc 1-10 scale)</w:t>
+        <w:t>Hệ thống đánh giá phim cơ bản</w:t>
+      </w:r>
+      <w:r>
+        <w:t xml:space="preserve"> (1-5 stars)</w:t>
       </w:r>
     </w:p>
     <w:p>
@@ -1965,7 +2700,13 @@
         </w:numPr>
       </w:pPr>
       <w:r>
-        <w:t>Rating component trên movie detail page</w:t>
+        <w:t xml:space="preserve">Rating component </w:t>
+      </w:r>
+      <w:r>
+        <w:t xml:space="preserve">được hiển thị trên </w:t>
+      </w:r>
+      <w:r>
+        <w:t>movie detail page</w:t>
       </w:r>
     </w:p>
     <w:p>
@@ -2000,6 +2741,9 @@
       <w:r>
         <w:t>Display user's personal rating riêng biệt với TMDB rating</w:t>
       </w:r>
+      <w:r>
+        <w:t xml:space="preserve"> (Optional)</w:t>
+      </w:r>
     </w:p>
     <w:p>
       <w:pPr>
@@ -2009,6 +2753,7 @@
         </w:numPr>
       </w:pPr>
       <w:r>
+        <w:lastRenderedPageBreak/>
         <w:t>User có thể comment ý kiến riêng của mình về phim</w:t>
       </w:r>
     </w:p>
@@ -2042,7 +2787,7 @@
           <w:b/>
           <w:bCs/>
         </w:rPr>
-        <w:t>3</w:t>
+        <w:t>5</w:t>
       </w:r>
       <w:r>
         <w:rPr>
@@ -2129,7 +2874,10 @@
         </w:numPr>
       </w:pPr>
       <w:r>
-        <w:t>Categorized recommendations ("Because you liked X")</w:t>
+        <w:t>Đề xuất được phân loại theo</w:t>
+      </w:r>
+      <w:r>
+        <w:t xml:space="preserve"> ("Because you liked X")</w:t>
       </w:r>
     </w:p>
     <w:p>
@@ -2140,8 +2888,7 @@
         </w:numPr>
       </w:pPr>
       <w:r>
-        <w:lastRenderedPageBreak/>
-        <w:t>Simple algorithm dựa trên genre preferences</w:t>
+        <w:t>Sử dụng thuật toán đơn giản dựa trên sở thích để phân loạ</w:t>
       </w:r>
     </w:p>
     <w:p>
@@ -2152,22 +2899,56 @@
         </w:numPr>
       </w:pPr>
       <w:r>
-        <w:t>Không cần machine learning phức tạp</w:t>
-      </w:r>
-    </w:p>
-    <w:p>
-      <w:pPr>
-        <w:rPr>
-          <w:b/>
-          <w:bCs/>
-        </w:rPr>
-      </w:pPr>
-      <w:r>
-        <w:rPr>
-          <w:b/>
-          <w:bCs/>
-        </w:rPr>
-        <w:t>US-14: Lưu Lịch Sử Xem Phim</w:t>
+        <w:t xml:space="preserve">Không cần </w:t>
+      </w:r>
+      <w:r>
+        <w:t>dùng AI để làm</w:t>
+      </w:r>
+      <w:r>
+        <w:t xml:space="preserve"> phức tạp</w:t>
+      </w:r>
+    </w:p>
+    <w:p>
+      <w:pPr>
+        <w:numPr>
+          <w:ilvl w:val="0"/>
+          <w:numId w:val="74"/>
+        </w:numPr>
+      </w:pPr>
+      <w:r>
+        <w:t>Refresh recommendations định kỳ</w:t>
+      </w:r>
+      <w:r>
+        <w:t xml:space="preserve"> (extra)</w:t>
+      </w:r>
+    </w:p>
+    <w:p>
+      <w:pPr>
+        <w:rPr>
+          <w:b/>
+          <w:bCs/>
+        </w:rPr>
+      </w:pPr>
+      <w:r>
+        <w:rPr>
+          <w:b/>
+          <w:bCs/>
+        </w:rPr>
+        <w:t>US-1</w:t>
+      </w:r>
+      <w:r>
+        <w:rPr>
+          <w:b/>
+          <w:bCs/>
+        </w:rPr>
+        <w:t>6</w:t>
+      </w:r>
+      <w:r>
+        <w:rPr>
+          <w:b/>
+          <w:bCs/>
+        </w:rPr>
+        <w:t>: Lưu Lịch Sử Xem Phim</w:t>
       </w:r>
     </w:p>
     <w:p>
@@ -2231,7 +3012,13 @@
         </w:numPr>
       </w:pPr>
       <w:r>
-        <w:t xml:space="preserve">Khi người dùng truy cập trang chi tiết của một phim hoặc TV Show và nhấn xem trailer hoặc nhấn nút “Đã xem”, nội dung đó sẽ được thêm vào danh sách </w:t>
+        <w:t>Khi người dùng truy cập trang chi tiết của một phim hoặc TV Show và nhấn xem trailer hoặc nhấn nút “</w:t>
+      </w:r>
+      <w:r>
+        <w:t>Xem phim</w:t>
+      </w:r>
+      <w:r>
+        <w:t xml:space="preserve">”, nội dung đó sẽ được thêm vào danh sách </w:t>
       </w:r>
       <w:r>
         <w:rPr>
@@ -2366,11 +3153,44 @@
           <w:bCs/>
         </w:rPr>
       </w:pPr>
-      <w:r>
-        <w:rPr>
-          <w:b/>
-          <w:bCs/>
-        </w:rPr>
+    </w:p>
+    <w:p>
+      <w:pPr>
+        <w:rPr>
+          <w:b/>
+          <w:bCs/>
+        </w:rPr>
+      </w:pPr>
+    </w:p>
+    <w:p>
+      <w:pPr>
+        <w:rPr>
+          <w:b/>
+          <w:bCs/>
+        </w:rPr>
+      </w:pPr>
+    </w:p>
+    <w:p>
+      <w:pPr>
+        <w:rPr>
+          <w:b/>
+          <w:bCs/>
+        </w:rPr>
+      </w:pPr>
+    </w:p>
+    <w:p>
+      <w:pPr>
+        <w:rPr>
+          <w:b/>
+          <w:bCs/>
+        </w:rPr>
+      </w:pPr>
+      <w:r>
+        <w:rPr>
+          <w:b/>
+          <w:bCs/>
+        </w:rPr>
+        <w:lastRenderedPageBreak/>
         <w:t>Giao Diện &amp; Khả Năng Tiếp Cận</w:t>
       </w:r>
     </w:p>
@@ -2393,7 +3213,7 @@
           <w:b/>
           <w:bCs/>
         </w:rPr>
-        <w:t>5</w:t>
+        <w:t>7</w:t>
       </w:r>
       <w:r>
         <w:rPr>
@@ -2480,7 +3300,7 @@
         </w:numPr>
       </w:pPr>
       <w:r>
-        <w:t>Touch-friendly interface elements</w:t>
+        <w:t>Các yếu tố giao diện dễ tương tác bằng cảm ứng (touch-friendly)</w:t>
       </w:r>
     </w:p>
     <w:p>
@@ -2491,7 +3311,7 @@
         </w:numPr>
       </w:pPr>
       <w:r>
-        <w:t>Proper text sizing và contrast theo BRD color scheme</w:t>
+        <w:t>Kích thước văn bản và độ tương phản phù hợp theo bảng màu BRD</w:t>
       </w:r>
     </w:p>
     <w:p>
@@ -2502,7 +3322,7 @@
         </w:numPr>
       </w:pPr>
       <w:r>
-        <w:t>Fast loading trên mobile networks</w:t>
+        <w:t>Landing page riêng cho mobile users (first-time visitors)</w:t>
       </w:r>
     </w:p>
     <w:p>
@@ -2513,7 +3333,7 @@
         </w:numPr>
       </w:pPr>
       <w:r>
-        <w:t>Landing page riêng cho mobile users (first-time visitors)</w:t>
+        <w:t>Optimize (extra)</w:t>
       </w:r>
     </w:p>
     <w:p>
@@ -2535,7 +3355,7 @@
           <w:b/>
           <w:bCs/>
         </w:rPr>
-        <w:t>6</w:t>
+        <w:t>8</w:t>
       </w:r>
       <w:r>
         <w:rPr>
@@ -2544,6 +3364,13 @@
         </w:rPr>
         <w:t>: Hỗ Trợ Accessibility Cơ Bản</w:t>
       </w:r>
+      <w:r>
+        <w:rPr>
+          <w:b/>
+          <w:bCs/>
+        </w:rPr>
+        <w:t xml:space="preserve"> (Optional)</w:t>
+      </w:r>
     </w:p>
     <w:p>
       <w:r>
@@ -2589,7 +3416,6 @@
           <w:b/>
           <w:bCs/>
         </w:rPr>
-        <w:lastRenderedPageBreak/>
         <w:t>Tiêu Chí Chấp Nhận:</w:t>
       </w:r>
     </w:p>
@@ -2601,7 +3427,7 @@
         </w:numPr>
       </w:pPr>
       <w:r>
-        <w:t>Semantic HTML structure</w:t>
+        <w:t>Cấu trúc HTML ngữ nghĩa (Semantic HTML structure)</w:t>
       </w:r>
     </w:p>
     <w:p>
@@ -2612,7 +3438,7 @@
         </w:numPr>
       </w:pPr>
       <w:r>
-        <w:t>Proper ARIA labels cho interactive elements</w:t>
+        <w:t>Nhãn ARIA phù hợp cho các yếu tố tương tác (interactive elements)</w:t>
       </w:r>
     </w:p>
     <w:p>
@@ -2623,7 +3449,7 @@
         </w:numPr>
       </w:pPr>
       <w:r>
-        <w:t>Keyboard navigation support</w:t>
+        <w:t>Hỗ trợ điều hướng bằng bàn phím (Keyboard navigation support)</w:t>
       </w:r>
     </w:p>
     <w:p>
@@ -2634,7 +3460,7 @@
         </w:numPr>
       </w:pPr>
       <w:r>
-        <w:t>Sufficient color contrast theo BRD guidelines</w:t>
+        <w:t>Độ tương phản màu sắc đủ theo hướng dẫn BRD</w:t>
       </w:r>
     </w:p>
     <w:p>
@@ -2671,7 +3497,14 @@
           <w:b/>
           <w:bCs/>
         </w:rPr>
-        <w:t>Hiệu Suất &amp; Tính Năng Kỹ Thuật</w:t>
+        <w:t xml:space="preserve">Hiệu Suất </w:t>
+      </w:r>
+      <w:r>
+        <w:rPr>
+          <w:b/>
+          <w:bCs/>
+        </w:rPr>
+        <w:t>tối ưu</w:t>
       </w:r>
     </w:p>
     <w:p>
@@ -2693,138 +3526,7 @@
           <w:b/>
           <w:bCs/>
         </w:rPr>
-        <w:t>7</w:t>
-      </w:r>
-      <w:r>
-        <w:rPr>
-          <w:b/>
-          <w:bCs/>
-        </w:rPr>
-        <w:t>: PWA Support Cơ Bản</w:t>
-      </w:r>
-    </w:p>
-    <w:p>
-      <w:r>
-        <w:rPr>
-          <w:b/>
-          <w:bCs/>
-        </w:rPr>
-        <w:t>Là</w:t>
-      </w:r>
-      <w:r>
-        <w:t xml:space="preserve"> một người dùng,</w:t>
-      </w:r>
-      <w:r>
-        <w:br/>
-      </w:r>
-      <w:r>
-        <w:rPr>
-          <w:b/>
-          <w:bCs/>
-        </w:rPr>
-        <w:t>Tôi muốn</w:t>
-      </w:r>
-      <w:r>
-        <w:t xml:space="preserve"> cài đặt ứng dụng trên thiết bị của mình,</w:t>
-      </w:r>
-      <w:r>
-        <w:br/>
-      </w:r>
-      <w:r>
-        <w:rPr>
-          <w:b/>
-          <w:bCs/>
-        </w:rPr>
-        <w:t>Để</w:t>
-      </w:r>
-      <w:r>
-        <w:t xml:space="preserve"> có thể truy cập nó nhanh chóng như một ứng dụng native.</w:t>
-      </w:r>
-    </w:p>
-    <w:p>
-      <w:r>
-        <w:rPr>
-          <w:b/>
-          <w:bCs/>
-        </w:rPr>
-        <w:t>Tiêu Chí Chấp Nhận:</w:t>
-      </w:r>
-    </w:p>
-    <w:p>
-      <w:pPr>
-        <w:numPr>
-          <w:ilvl w:val="0"/>
-          <w:numId w:val="78"/>
-        </w:numPr>
-      </w:pPr>
-      <w:r>
-        <w:t>Web App Manifest được cấu hình đúng</w:t>
-      </w:r>
-    </w:p>
-    <w:p>
-      <w:pPr>
-        <w:numPr>
-          <w:ilvl w:val="0"/>
-          <w:numId w:val="78"/>
-        </w:numPr>
-      </w:pPr>
-      <w:r>
-        <w:t>Service Worker cho basic caching</w:t>
-      </w:r>
-    </w:p>
-    <w:p>
-      <w:pPr>
-        <w:numPr>
-          <w:ilvl w:val="0"/>
-          <w:numId w:val="78"/>
-        </w:numPr>
-      </w:pPr>
-      <w:r>
-        <w:t>Install prompt cho supported devices</w:t>
-      </w:r>
-    </w:p>
-    <w:p>
-      <w:pPr>
-        <w:numPr>
-          <w:ilvl w:val="0"/>
-          <w:numId w:val="78"/>
-        </w:numPr>
-      </w:pPr>
-      <w:r>
-        <w:t>Custom icons cho different screen sizes</w:t>
-      </w:r>
-    </w:p>
-    <w:p>
-      <w:pPr>
-        <w:numPr>
-          <w:ilvl w:val="0"/>
-          <w:numId w:val="78"/>
-        </w:numPr>
-      </w:pPr>
-      <w:r>
-        <w:t>Splash screen khi launch app</w:t>
-      </w:r>
-    </w:p>
-    <w:p>
-      <w:pPr>
-        <w:rPr>
-          <w:b/>
-          <w:bCs/>
-        </w:rPr>
-      </w:pPr>
-      <w:r>
-        <w:rPr>
-          <w:b/>
-          <w:bCs/>
-        </w:rPr>
-        <w:t>US-1</w:t>
-      </w:r>
-      <w:r>
-        <w:rPr>
-          <w:b/>
-          <w:bCs/>
-        </w:rPr>
-        <w:t>8</w:t>
+        <w:t>9</w:t>
       </w:r>
       <w:r>
         <w:rPr>
@@ -2933,18 +3635,8 @@
         </w:numPr>
       </w:pPr>
       <w:r>
-        <w:t>Critical CSS inlined</w:t>
-      </w:r>
-    </w:p>
-    <w:p>
-      <w:pPr>
-        <w:numPr>
-          <w:ilvl w:val="0"/>
-          <w:numId w:val="79"/>
-        </w:numPr>
-      </w:pPr>
-      <w:r>
-        <w:t>Core Web Vitals trong acceptable range</w:t>
+        <w:lastRenderedPageBreak/>
+        <w:t>Thêm Lazy Loading cho các page đang hoặc sắp được load</w:t>
       </w:r>
     </w:p>
     <w:p>
@@ -2981,7 +3673,7 @@
           <w:b/>
           <w:bCs/>
         </w:rPr>
-        <w:t>19</w:t>
+        <w:t>20</w:t>
       </w:r>
       <w:r>
         <w:rPr>
@@ -2997,7 +3689,6 @@
           <w:b/>
           <w:bCs/>
         </w:rPr>
-        <w:lastRenderedPageBreak/>
         <w:t>Là</w:t>
       </w:r>
       <w:r>
@@ -3047,7 +3738,10 @@
         </w:numPr>
       </w:pPr>
       <w:r>
-        <w:t>Landing page riêng cho mobile first-time visitors</w:t>
+        <w:t xml:space="preserve">Landing page riêng cho mobile </w:t>
+      </w:r>
+      <w:r>
+        <w:t>user truy cập lần đầu</w:t>
       </w:r>
     </w:p>
     <w:p>
@@ -3058,7 +3752,7 @@
         </w:numPr>
       </w:pPr>
       <w:r>
-        <w:t>Giới thiệu key features và benefits</w:t>
+        <w:t>Giới thiệu các tính năng và lợi ích chính</w:t>
       </w:r>
     </w:p>
     <w:p>
@@ -3069,7 +3763,13 @@
         </w:numPr>
       </w:pPr>
       <w:r>
-        <w:t>Clear "Enter App" CTA button</w:t>
+        <w:t xml:space="preserve">Nút CTA </w:t>
+      </w:r>
+      <w:r>
+        <w:t xml:space="preserve">"Enter App" </w:t>
+      </w:r>
+      <w:r>
+        <w:t xml:space="preserve">rõ ràng </w:t>
       </w:r>
     </w:p>
     <w:p>
@@ -3080,7 +3780,7 @@
         </w:numPr>
       </w:pPr>
       <w:r>
-        <w:t>Fast loading với optimized assets</w:t>
+        <w:t>Tải nhanh với tài nguyên được tối ưu hóa</w:t>
       </w:r>
     </w:p>
     <w:p>
@@ -3091,7 +3791,10 @@
         </w:numPr>
       </w:pPr>
       <w:r>
-        <w:t>Consistent branding với main app</w:t>
+        <w:t xml:space="preserve">Thương hiệu nhất quán </w:t>
+      </w:r>
+      <w:r>
+        <w:t>với main app</w:t>
       </w:r>
     </w:p>
     <w:p>
@@ -3102,7 +3805,10 @@
         </w:numPr>
       </w:pPr>
       <w:r>
-        <w:t>Skip option cho returning users</w:t>
+        <w:t>Tùy chọn bỏ qua cho người dùng quay lạ</w:t>
+      </w:r>
+      <w:r>
+        <w:t>i</w:t>
       </w:r>
     </w:p>
     <w:p>
@@ -3131,7 +3837,7 @@
           <w:b/>
           <w:bCs/>
         </w:rPr>
-        <w:t>0</w:t>
+        <w:t>1</w:t>
       </w:r>
       <w:r>
         <w:rPr>
@@ -3163,7 +3869,19 @@
         <w:t>Tôi muốn</w:t>
       </w:r>
       <w:r>
-        <w:t xml:space="preserve"> browse và search movies,</w:t>
+        <w:t xml:space="preserve"> </w:t>
+      </w:r>
+      <w:r>
+        <w:t>duyệt</w:t>
+      </w:r>
+      <w:r>
+        <w:t xml:space="preserve"> và </w:t>
+      </w:r>
+      <w:r>
+        <w:t>tìm kiếm</w:t>
+      </w:r>
+      <w:r>
+        <w:t xml:space="preserve"> movies,</w:t>
       </w:r>
       <w:r>
         <w:br/>
@@ -3196,7 +3914,7 @@
         </w:numPr>
       </w:pPr>
       <w:r>
-        <w:t>Guest users có thể view movies, search, và xem details</w:t>
+        <w:t>Users có thể xem phim, tìm kiếm và xem chi tiết của phim đó nhưng không thêm phim vào watch list hay xem tiến trình phim</w:t>
       </w:r>
     </w:p>
     <w:p>
@@ -3218,7 +3936,16 @@
         </w:numPr>
       </w:pPr>
       <w:r>
-        <w:t>Clear messaging về benefits của việc đăng nhập</w:t>
+        <w:t>Thông báo quyền lợi</w:t>
+      </w:r>
+      <w:r>
+        <w:t xml:space="preserve"> của </w:t>
+      </w:r>
+      <w:r>
+        <w:t xml:space="preserve">users qua </w:t>
+      </w:r>
+      <w:r>
+        <w:t>việc đăng nhập</w:t>
       </w:r>
     </w:p>
     <w:p>
@@ -3229,7 +3956,10 @@
         </w:numPr>
       </w:pPr>
       <w:r>
-        <w:t>Login/signup links trong prompt</w:t>
+        <w:t xml:space="preserve">Login/signup links trong </w:t>
+      </w:r>
+      <w:r>
+        <w:t>sidebar</w:t>
       </w:r>
     </w:p>
     <w:p>
@@ -3240,7 +3970,7 @@
         </w:numPr>
       </w:pPr>
       <w:r>
-        <w:t>Redirect về current page sau successful login</w:t>
+        <w:t>Chuyển hướng về main sau khi đăng nhập xong</w:t>
       </w:r>
     </w:p>
     <w:p>
@@ -3251,7 +3981,18 @@
         </w:numPr>
       </w:pPr>
       <w:r>
-        <w:t>Real-time sidebar state update sau login/logout</w:t>
+        <w:t>Cập nhật trạng thái sidebar theo thời gian thực sau khi login/logout</w:t>
+      </w:r>
+    </w:p>
+    <w:p>
+      <w:pPr>
+        <w:numPr>
+          <w:ilvl w:val="0"/>
+          <w:numId w:val="81"/>
+        </w:numPr>
+      </w:pPr>
+      <w:r>
+        <w:t>Guest mode limitations được giải thích rõ ràng</w:t>
       </w:r>
     </w:p>
     <w:p>
@@ -3273,7 +4014,7 @@
           <w:b/>
           <w:bCs/>
         </w:rPr>
-        <w:t>1</w:t>
+        <w:t>2</w:t>
       </w:r>
       <w:r>
         <w:rPr>
@@ -3305,7 +4046,13 @@
         <w:t>Tôi muốn</w:t>
       </w:r>
       <w:r>
-        <w:t xml:space="preserve"> thấy thông tin về movie viewing availability,</w:t>
+        <w:t xml:space="preserve"> thấy thông tin về </w:t>
+      </w:r>
+      <w:r>
+        <w:t>khả năng xem phim</w:t>
+      </w:r>
+      <w:r>
+        <w:t>,</w:t>
       </w:r>
       <w:r>
         <w:br/>
@@ -3318,7 +4065,13 @@
         <w:t>Để</w:t>
       </w:r>
       <w:r>
-        <w:t xml:space="preserve"> hiểu về content access limitations.</w:t>
+        <w:t xml:space="preserve"> hiểu về </w:t>
+      </w:r>
+      <w:r>
+        <w:t>hạn chế nội dung vì bản quyền</w:t>
+      </w:r>
+      <w:r>
+        <w:t>.</w:t>
       </w:r>
     </w:p>
     <w:p>
@@ -3338,7 +4091,7 @@
         </w:numPr>
       </w:pPr>
       <w:r>
-        <w:t>Movie detail page có section về viewing options</w:t>
+        <w:t>Trang chi tiết phim có phần về các tùy chọn xem</w:t>
       </w:r>
     </w:p>
     <w:p>
@@ -3349,7 +4102,7 @@
         </w:numPr>
       </w:pPr>
       <w:r>
-        <w:t>Error interface template cho copyright restrictions</w:t>
+        <w:t>Mẫu giao diện lỗi cho các hạn chế bản quyền</w:t>
       </w:r>
     </w:p>
     <w:p>
@@ -3360,7 +4113,10 @@
         </w:numPr>
       </w:pPr>
       <w:r>
-        <w:t>Consistent messaging về content availability</w:t>
+        <w:t>Thông báo nhất quán về khả năng truy cập nội dun</w:t>
+      </w:r>
+      <w:r>
+        <w:t>g</w:t>
       </w:r>
     </w:p>
     <w:p>
@@ -3371,7 +4127,8 @@
         </w:numPr>
       </w:pPr>
       <w:r>
-        <w:t>Links to legitimate viewing platforms khi có sẵn</w:t>
+        <w:lastRenderedPageBreak/>
+        <w:t>Liên kết đến các nền tảng xem hợp pháp khi có sẵn</w:t>
       </w:r>
     </w:p>
     <w:p>
@@ -3382,7 +4139,7 @@
         </w:numPr>
       </w:pPr>
       <w:r>
-        <w:t>Educational content về legal movie watching</w:t>
+        <w:t>Nội dung giáo dục về việc xem phim hợp pháp</w:t>
       </w:r>
     </w:p>
     <w:p>
@@ -3408,6 +4165,214 @@
           <w:b/>
           <w:bCs/>
         </w:rPr>
+        <w:t>Extra</w:t>
+      </w:r>
+    </w:p>
+    <w:p>
+      <w:pPr>
+        <w:rPr>
+          <w:b/>
+          <w:bCs/>
+        </w:rPr>
+      </w:pPr>
+      <w:r>
+        <w:rPr>
+          <w:b/>
+          <w:bCs/>
+        </w:rPr>
+        <w:t>US-23: Coming Soon Page</w:t>
+      </w:r>
+    </w:p>
+    <w:p>
+      <w:r>
+        <w:rPr>
+          <w:b/>
+          <w:bCs/>
+        </w:rPr>
+        <w:t>Là</w:t>
+      </w:r>
+      <w:r>
+        <w:t xml:space="preserve"> một người dùng,</w:t>
+      </w:r>
+      <w:r>
+        <w:br/>
+      </w:r>
+      <w:r>
+        <w:rPr>
+          <w:b/>
+          <w:bCs/>
+        </w:rPr>
+        <w:t>Tôi muốn</w:t>
+      </w:r>
+      <w:r>
+        <w:t xml:space="preserve"> thấy trang "Coming Soon" thay vì lỗi 404,</w:t>
+      </w:r>
+      <w:r>
+        <w:br/>
+      </w:r>
+      <w:r>
+        <w:rPr>
+          <w:b/>
+          <w:bCs/>
+        </w:rPr>
+        <w:t>Để</w:t>
+      </w:r>
+      <w:r>
+        <w:t xml:space="preserve"> biết rằng tính năng đang được phát triển và sẽ ra mắt sớm.</w:t>
+      </w:r>
+    </w:p>
+    <w:p>
+      <w:r>
+        <w:rPr>
+          <w:b/>
+          <w:bCs/>
+        </w:rPr>
+        <w:t>Tiêu Chí Chấp Nhận:</w:t>
+      </w:r>
+    </w:p>
+    <w:p>
+      <w:pPr>
+        <w:numPr>
+          <w:ilvl w:val="0"/>
+          <w:numId w:val="91"/>
+        </w:numPr>
+      </w:pPr>
+      <w:r>
+        <w:t>Trang "Coming Soon" hiển thị cho các routes/features chưa hoàn thành</w:t>
+      </w:r>
+    </w:p>
+    <w:p>
+      <w:pPr>
+        <w:numPr>
+          <w:ilvl w:val="0"/>
+          <w:numId w:val="91"/>
+        </w:numPr>
+      </w:pPr>
+      <w:r>
+        <w:t>Thiết kế nhất quán với brand identity của CineHub</w:t>
+      </w:r>
+    </w:p>
+    <w:p>
+      <w:pPr>
+        <w:numPr>
+          <w:ilvl w:val="0"/>
+          <w:numId w:val="91"/>
+        </w:numPr>
+      </w:pPr>
+      <w:r>
+        <w:t>Hiển thị thông điệp rõ ràng: "Tính năng đang phát triển"</w:t>
+      </w:r>
+    </w:p>
+    <w:p>
+      <w:pPr>
+        <w:numPr>
+          <w:ilvl w:val="0"/>
+          <w:numId w:val="91"/>
+        </w:numPr>
+      </w:pPr>
+      <w:r>
+        <w:t>Có countdown timer hoặc timeline dự kiến (optional)</w:t>
+      </w:r>
+    </w:p>
+    <w:p>
+      <w:pPr>
+        <w:numPr>
+          <w:ilvl w:val="0"/>
+          <w:numId w:val="91"/>
+        </w:numPr>
+      </w:pPr>
+      <w:r>
+        <w:t>Nút "Quay về trang chủ" hoặc "Khám phá các tính năng khác"</w:t>
+      </w:r>
+    </w:p>
+    <w:p>
+      <w:pPr>
+        <w:numPr>
+          <w:ilvl w:val="0"/>
+          <w:numId w:val="91"/>
+        </w:numPr>
+      </w:pPr>
+      <w:r>
+        <w:t>Responsive design phù hợp với mobile và desktop</w:t>
+      </w:r>
+    </w:p>
+    <w:p>
+      <w:pPr>
+        <w:numPr>
+          <w:ilvl w:val="0"/>
+          <w:numId w:val="91"/>
+        </w:numPr>
+      </w:pPr>
+      <w:r>
+        <w:t>Animation nhẹ nhàng để trang không quá tĩnh</w:t>
+      </w:r>
+    </w:p>
+    <w:p>
+      <w:pPr>
+        <w:numPr>
+          <w:ilvl w:val="0"/>
+          <w:numId w:val="91"/>
+        </w:numPr>
+      </w:pPr>
+      <w:r>
+        <w:t>Có thể customize message cho từng tính năng khác nhau</w:t>
+      </w:r>
+    </w:p>
+    <w:p>
+      <w:r>
+        <w:rPr>
+          <w:b/>
+          <w:bCs/>
+        </w:rPr>
+        <w:t>Các trường hợp sử dụng:</w:t>
+      </w:r>
+    </w:p>
+    <w:p>
+      <w:pPr>
+        <w:numPr>
+          <w:ilvl w:val="0"/>
+          <w:numId w:val="92"/>
+        </w:numPr>
+      </w:pPr>
+      <w:r>
+        <w:t>User click vào các menu item chưa hoàn thành</w:t>
+      </w:r>
+    </w:p>
+    <w:p>
+      <w:pPr>
+        <w:numPr>
+          <w:ilvl w:val="0"/>
+          <w:numId w:val="92"/>
+        </w:numPr>
+      </w:pPr>
+      <w:r>
+        <w:t>Truy cập các routes đang trong quá trình phát triển</w:t>
+      </w:r>
+    </w:p>
+    <w:p>
+      <w:pPr>
+        <w:numPr>
+          <w:ilvl w:val="0"/>
+          <w:numId w:val="92"/>
+        </w:numPr>
+      </w:pPr>
+      <w:r>
+        <w:t>Thay thế cho các placeholder components</w:t>
+      </w:r>
+    </w:p>
+    <w:p/>
+    <w:p>
+      <w:pPr>
+        <w:rPr>
+          <w:b/>
+          <w:bCs/>
+        </w:rPr>
+      </w:pPr>
+      <w:r>
+        <w:rPr>
+          <w:b/>
+          <w:bCs/>
+        </w:rPr>
         <w:t>Ghi Chú Triển Khai Kỹ Thuật</w:t>
       </w:r>
     </w:p>
@@ -3423,8 +4388,7 @@
           <w:b/>
           <w:bCs/>
         </w:rPr>
-        <w:lastRenderedPageBreak/>
-        <w:t>Design System Implementation</w:t>
+        <w:t>Triển khai hệ thống</w:t>
       </w:r>
     </w:p>
     <w:p>
@@ -3435,7 +4399,7 @@
         </w:numPr>
       </w:pPr>
       <w:r>
-        <w:t>Implement color scheme và typography theo BRD specifications</w:t>
+        <w:t>Triển khải bảng màu và kiểu chữ theo thông số bên BRD</w:t>
       </w:r>
     </w:p>
     <w:p>
@@ -3446,7 +4410,7 @@
         </w:numPr>
       </w:pPr>
       <w:r>
-        <w:t>Sử dụng Tailwind CSS với custom theme configuration</w:t>
+        <w:t>Sử dụng Tailwind CSS</w:t>
       </w:r>
     </w:p>
     <w:p>
@@ -3457,7 +4421,13 @@
         </w:numPr>
       </w:pPr>
       <w:r>
-        <w:t>shadcn/ui components với custom styling</w:t>
+        <w:t xml:space="preserve">Các </w:t>
+      </w:r>
+      <w:r>
+        <w:t>components bên</w:t>
+      </w:r>
+      <w:r>
+        <w:t xml:space="preserve"> shadcn/ui với kiểu dáng tùy chỉnh</w:t>
       </w:r>
     </w:p>
     <w:p>
@@ -3468,22 +4438,22 @@
         </w:numPr>
       </w:pPr>
       <w:r>
-        <w:t>Consistent spacing, border radius, và visual hierarchy</w:t>
-      </w:r>
-    </w:p>
-    <w:p>
-      <w:pPr>
-        <w:rPr>
-          <w:b/>
-          <w:bCs/>
-        </w:rPr>
-      </w:pPr>
-      <w:r>
-        <w:rPr>
-          <w:b/>
-          <w:bCs/>
-        </w:rPr>
-        <w:t>Authentication Flow</w:t>
+        <w:t>Khoảng cách, bán kính đường viền và phân cấp hình ảnh nhất quán</w:t>
+      </w:r>
+    </w:p>
+    <w:p>
+      <w:pPr>
+        <w:rPr>
+          <w:b/>
+          <w:bCs/>
+        </w:rPr>
+      </w:pPr>
+      <w:r>
+        <w:rPr>
+          <w:b/>
+          <w:bCs/>
+        </w:rPr>
+        <w:t>Luồng xác thực</w:t>
       </w:r>
     </w:p>
     <w:p>
@@ -3494,7 +4464,16 @@
         </w:numPr>
       </w:pPr>
       <w:r>
-        <w:t>NextAuth.js setup với email/password và Google providers</w:t>
+        <w:t>Thiết lập NextAuth.js với email/mật khẩu</w:t>
+      </w:r>
+      <w:r>
+        <w:t xml:space="preserve">, </w:t>
+      </w:r>
+      <w:r>
+        <w:t>Google</w:t>
+      </w:r>
+      <w:r>
+        <w:t xml:space="preserve"> và Facebook</w:t>
       </w:r>
     </w:p>
     <w:p>
@@ -3516,7 +4495,13 @@
         </w:numPr>
       </w:pPr>
       <w:r>
-        <w:t>Firebase chỉ cho Google authentication</w:t>
+        <w:t xml:space="preserve">Firebase chỉ cho Google </w:t>
+      </w:r>
+      <w:r>
+        <w:t xml:space="preserve"> và Facebook </w:t>
+      </w:r>
+      <w:r>
+        <w:t>authentication</w:t>
       </w:r>
     </w:p>
     <w:p>
@@ -3527,6 +4512,7 @@
         </w:numPr>
       </w:pPr>
       <w:r>
+        <w:lastRenderedPageBreak/>
         <w:t>JWT token management</w:t>
       </w:r>
     </w:p>
@@ -3553,7 +4539,7 @@
           <w:b/>
           <w:bCs/>
         </w:rPr>
-        <w:t>API Integration</w:t>
+        <w:t>Kết nối API</w:t>
       </w:r>
     </w:p>
     <w:p>
@@ -3564,7 +4550,10 @@
         </w:numPr>
       </w:pPr>
       <w:r>
-        <w:t>TMDB API wrapper với error handling</w:t>
+        <w:t>Wrapper API TMDB với xử lý lỗ</w:t>
+      </w:r>
+      <w:r>
+        <w:t>i</w:t>
       </w:r>
     </w:p>
     <w:p>
@@ -3586,7 +4575,7 @@
         </w:numPr>
       </w:pPr>
       <w:r>
-        <w:t>Rate limiting awareness</w:t>
+        <w:t>Nhận thức về giới hạn tốc độ (Rate limiting awareness)</w:t>
       </w:r>
     </w:p>
     <w:p>
@@ -3597,128 +4586,18 @@
         </w:numPr>
       </w:pPr>
       <w:r>
-        <w:t>Fallback handling cho API failures</w:t>
-      </w:r>
-    </w:p>
-    <w:p>
-      <w:pPr>
-        <w:rPr>
-          <w:b/>
-          <w:bCs/>
-        </w:rPr>
-      </w:pPr>
-      <w:r>
-        <w:rPr>
-          <w:b/>
-          <w:bCs/>
-        </w:rPr>
-        <w:t>Database Schema (MySQL)</w:t>
-      </w:r>
-    </w:p>
-    <w:p>
-      <w:pPr>
-        <w:numPr>
-          <w:ilvl w:val="0"/>
-          <w:numId w:val="86"/>
-        </w:numPr>
-      </w:pPr>
-      <w:r>
-        <w:t>Users table: id, email, password_hash, display_name, created_at</w:t>
-      </w:r>
-    </w:p>
-    <w:p>
-      <w:pPr>
-        <w:numPr>
-          <w:ilvl w:val="0"/>
-          <w:numId w:val="86"/>
-        </w:numPr>
-      </w:pPr>
-      <w:r>
-        <w:t>Watchlists table: user_id, movie_id, added_at</w:t>
-      </w:r>
-    </w:p>
-    <w:p>
-      <w:pPr>
-        <w:numPr>
-          <w:ilvl w:val="0"/>
-          <w:numId w:val="86"/>
-        </w:numPr>
-      </w:pPr>
-      <w:r>
-        <w:t>Ratings table: user_id, movie_id, rating, created_at</w:t>
-      </w:r>
-    </w:p>
-    <w:p>
-      <w:pPr>
-        <w:numPr>
-          <w:ilvl w:val="0"/>
-          <w:numId w:val="86"/>
-        </w:numPr>
-      </w:pPr>
-      <w:r>
-        <w:t>Simple relational structure</w:t>
-      </w:r>
-    </w:p>
-    <w:p>
-      <w:pPr>
-        <w:rPr>
-          <w:b/>
-          <w:bCs/>
-        </w:rPr>
-      </w:pPr>
-      <w:r>
-        <w:rPr>
-          <w:b/>
-          <w:bCs/>
-        </w:rPr>
-        <w:t>Deployment Strategy</w:t>
-      </w:r>
-    </w:p>
-    <w:p>
-      <w:pPr>
-        <w:numPr>
-          <w:ilvl w:val="0"/>
-          <w:numId w:val="87"/>
-        </w:numPr>
-      </w:pPr>
-      <w:r>
-        <w:t>Vercel deployment với environment variables</w:t>
-      </w:r>
-    </w:p>
-    <w:p>
-      <w:pPr>
-        <w:numPr>
-          <w:ilvl w:val="0"/>
-          <w:numId w:val="87"/>
-        </w:numPr>
-      </w:pPr>
-      <w:r>
-        <w:t>GitHub Actions cho CI/CD</w:t>
-      </w:r>
-    </w:p>
-    <w:p>
-      <w:pPr>
-        <w:numPr>
-          <w:ilvl w:val="0"/>
-          <w:numId w:val="87"/>
-        </w:numPr>
-      </w:pPr>
-      <w:r>
-        <w:t>Environment separation (dev/production)</w:t>
-      </w:r>
-    </w:p>
-    <w:p>
-      <w:pPr>
-        <w:numPr>
-          <w:ilvl w:val="0"/>
-          <w:numId w:val="87"/>
-        </w:numPr>
-      </w:pPr>
-      <w:r>
-        <w:t>Error monitoring setup</w:t>
-      </w:r>
-    </w:p>
-    <w:p/>
+        <w:t>Xử lý f</w:t>
+      </w:r>
+      <w:r>
+        <w:t xml:space="preserve">allback handling cho </w:t>
+      </w:r>
+      <w:r>
+        <w:t>các lỗi API</w:t>
+      </w:r>
+      <w:r>
+        <w:tab/>
+      </w:r>
+    </w:p>
     <w:sectPr>
       <w:pgSz w:w="11909" w:h="16834" w:code="9"/>
       <w:pgMar w:top="1411" w:right="1138" w:bottom="1411" w:left="1987" w:header="720" w:footer="720" w:gutter="0"/>
@@ -6265,6 +7144,155 @@
     </w:lvl>
   </w:abstractNum>
   <w:abstractNum w:abstractNumId="17" w15:restartNumberingAfterBreak="0">
+    <w:nsid w:val="19B90FA3"/>
+    <w:multiLevelType w:val="multilevel"/>
+    <w:tmpl w:val="33CC6894"/>
+    <w:lvl w:ilvl="0">
+      <w:start w:val="1"/>
+      <w:numFmt w:val="bullet"/>
+      <w:lvlText w:val=""/>
+      <w:lvlJc w:val="left"/>
+      <w:pPr>
+        <w:tabs>
+          <w:tab w:val="num" w:pos="720"/>
+        </w:tabs>
+        <w:ind w:left="720" w:hanging="360"/>
+      </w:pPr>
+      <w:rPr>
+        <w:rFonts w:ascii="Symbol" w:hAnsi="Symbol" w:hint="default"/>
+        <w:sz w:val="20"/>
+      </w:rPr>
+    </w:lvl>
+    <w:lvl w:ilvl="1" w:tentative="1">
+      <w:start w:val="1"/>
+      <w:numFmt w:val="bullet"/>
+      <w:lvlText w:val="o"/>
+      <w:lvlJc w:val="left"/>
+      <w:pPr>
+        <w:tabs>
+          <w:tab w:val="num" w:pos="1440"/>
+        </w:tabs>
+        <w:ind w:left="1440" w:hanging="360"/>
+      </w:pPr>
+      <w:rPr>
+        <w:rFonts w:ascii="Courier New" w:hAnsi="Courier New" w:hint="default"/>
+        <w:sz w:val="20"/>
+      </w:rPr>
+    </w:lvl>
+    <w:lvl w:ilvl="2" w:tentative="1">
+      <w:start w:val="1"/>
+      <w:numFmt w:val="bullet"/>
+      <w:lvlText w:val=""/>
+      <w:lvlJc w:val="left"/>
+      <w:pPr>
+        <w:tabs>
+          <w:tab w:val="num" w:pos="2160"/>
+        </w:tabs>
+        <w:ind w:left="2160" w:hanging="360"/>
+      </w:pPr>
+      <w:rPr>
+        <w:rFonts w:ascii="Wingdings" w:hAnsi="Wingdings" w:hint="default"/>
+        <w:sz w:val="20"/>
+      </w:rPr>
+    </w:lvl>
+    <w:lvl w:ilvl="3" w:tentative="1">
+      <w:start w:val="1"/>
+      <w:numFmt w:val="bullet"/>
+      <w:lvlText w:val=""/>
+      <w:lvlJc w:val="left"/>
+      <w:pPr>
+        <w:tabs>
+          <w:tab w:val="num" w:pos="2880"/>
+        </w:tabs>
+        <w:ind w:left="2880" w:hanging="360"/>
+      </w:pPr>
+      <w:rPr>
+        <w:rFonts w:ascii="Wingdings" w:hAnsi="Wingdings" w:hint="default"/>
+        <w:sz w:val="20"/>
+      </w:rPr>
+    </w:lvl>
+    <w:lvl w:ilvl="4" w:tentative="1">
+      <w:start w:val="1"/>
+      <w:numFmt w:val="bullet"/>
+      <w:lvlText w:val=""/>
+      <w:lvlJc w:val="left"/>
+      <w:pPr>
+        <w:tabs>
+          <w:tab w:val="num" w:pos="3600"/>
+        </w:tabs>
+        <w:ind w:left="3600" w:hanging="360"/>
+      </w:pPr>
+      <w:rPr>
+        <w:rFonts w:ascii="Wingdings" w:hAnsi="Wingdings" w:hint="default"/>
+        <w:sz w:val="20"/>
+      </w:rPr>
+    </w:lvl>
+    <w:lvl w:ilvl="5" w:tentative="1">
+      <w:start w:val="1"/>
+      <w:numFmt w:val="bullet"/>
+      <w:lvlText w:val=""/>
+      <w:lvlJc w:val="left"/>
+      <w:pPr>
+        <w:tabs>
+          <w:tab w:val="num" w:pos="4320"/>
+        </w:tabs>
+        <w:ind w:left="4320" w:hanging="360"/>
+      </w:pPr>
+      <w:rPr>
+        <w:rFonts w:ascii="Wingdings" w:hAnsi="Wingdings" w:hint="default"/>
+        <w:sz w:val="20"/>
+      </w:rPr>
+    </w:lvl>
+    <w:lvl w:ilvl="6" w:tentative="1">
+      <w:start w:val="1"/>
+      <w:numFmt w:val="bullet"/>
+      <w:lvlText w:val=""/>
+      <w:lvlJc w:val="left"/>
+      <w:pPr>
+        <w:tabs>
+          <w:tab w:val="num" w:pos="5040"/>
+        </w:tabs>
+        <w:ind w:left="5040" w:hanging="360"/>
+      </w:pPr>
+      <w:rPr>
+        <w:rFonts w:ascii="Wingdings" w:hAnsi="Wingdings" w:hint="default"/>
+        <w:sz w:val="20"/>
+      </w:rPr>
+    </w:lvl>
+    <w:lvl w:ilvl="7" w:tentative="1">
+      <w:start w:val="1"/>
+      <w:numFmt w:val="bullet"/>
+      <w:lvlText w:val=""/>
+      <w:lvlJc w:val="left"/>
+      <w:pPr>
+        <w:tabs>
+          <w:tab w:val="num" w:pos="5760"/>
+        </w:tabs>
+        <w:ind w:left="5760" w:hanging="360"/>
+      </w:pPr>
+      <w:rPr>
+        <w:rFonts w:ascii="Wingdings" w:hAnsi="Wingdings" w:hint="default"/>
+        <w:sz w:val="20"/>
+      </w:rPr>
+    </w:lvl>
+    <w:lvl w:ilvl="8" w:tentative="1">
+      <w:start w:val="1"/>
+      <w:numFmt w:val="bullet"/>
+      <w:lvlText w:val=""/>
+      <w:lvlJc w:val="left"/>
+      <w:pPr>
+        <w:tabs>
+          <w:tab w:val="num" w:pos="6480"/>
+        </w:tabs>
+        <w:ind w:left="6480" w:hanging="360"/>
+      </w:pPr>
+      <w:rPr>
+        <w:rFonts w:ascii="Wingdings" w:hAnsi="Wingdings" w:hint="default"/>
+        <w:sz w:val="20"/>
+      </w:rPr>
+    </w:lvl>
+  </w:abstractNum>
+  <w:abstractNum w:abstractNumId="18" w15:restartNumberingAfterBreak="0">
     <w:nsid w:val="1AE20DD3"/>
     <w:multiLevelType w:val="multilevel"/>
     <w:tmpl w:val="255C9618"/>
@@ -6413,7 +7441,7 @@
       </w:rPr>
     </w:lvl>
   </w:abstractNum>
-  <w:abstractNum w:abstractNumId="18" w15:restartNumberingAfterBreak="0">
+  <w:abstractNum w:abstractNumId="19" w15:restartNumberingAfterBreak="0">
     <w:nsid w:val="1D063100"/>
     <w:multiLevelType w:val="multilevel"/>
     <w:tmpl w:val="2EE4584A"/>
@@ -6562,7 +7590,7 @@
       </w:rPr>
     </w:lvl>
   </w:abstractNum>
-  <w:abstractNum w:abstractNumId="19" w15:restartNumberingAfterBreak="0">
+  <w:abstractNum w:abstractNumId="20" w15:restartNumberingAfterBreak="0">
     <w:nsid w:val="1EEA2907"/>
     <w:multiLevelType w:val="multilevel"/>
     <w:tmpl w:val="661CBBB2"/>
@@ -6711,7 +7739,7 @@
       </w:rPr>
     </w:lvl>
   </w:abstractNum>
-  <w:abstractNum w:abstractNumId="20" w15:restartNumberingAfterBreak="0">
+  <w:abstractNum w:abstractNumId="21" w15:restartNumberingAfterBreak="0">
     <w:nsid w:val="1FFC4E64"/>
     <w:multiLevelType w:val="multilevel"/>
     <w:tmpl w:val="1F92998C"/>
@@ -6860,7 +7888,7 @@
       </w:rPr>
     </w:lvl>
   </w:abstractNum>
-  <w:abstractNum w:abstractNumId="21" w15:restartNumberingAfterBreak="0">
+  <w:abstractNum w:abstractNumId="22" w15:restartNumberingAfterBreak="0">
     <w:nsid w:val="200759F9"/>
     <w:multiLevelType w:val="multilevel"/>
     <w:tmpl w:val="D0420218"/>
@@ -7009,7 +8037,7 @@
       </w:rPr>
     </w:lvl>
   </w:abstractNum>
-  <w:abstractNum w:abstractNumId="22" w15:restartNumberingAfterBreak="0">
+  <w:abstractNum w:abstractNumId="23" w15:restartNumberingAfterBreak="0">
     <w:nsid w:val="21852C6E"/>
     <w:multiLevelType w:val="multilevel"/>
     <w:tmpl w:val="581224D0"/>
@@ -7158,7 +8186,7 @@
       </w:rPr>
     </w:lvl>
   </w:abstractNum>
-  <w:abstractNum w:abstractNumId="23" w15:restartNumberingAfterBreak="0">
+  <w:abstractNum w:abstractNumId="24" w15:restartNumberingAfterBreak="0">
     <w:nsid w:val="229C0144"/>
     <w:multiLevelType w:val="multilevel"/>
     <w:tmpl w:val="76A2B988"/>
@@ -7307,7 +8335,7 @@
       </w:rPr>
     </w:lvl>
   </w:abstractNum>
-  <w:abstractNum w:abstractNumId="24" w15:restartNumberingAfterBreak="0">
+  <w:abstractNum w:abstractNumId="25" w15:restartNumberingAfterBreak="0">
     <w:nsid w:val="230A7DEA"/>
     <w:multiLevelType w:val="multilevel"/>
     <w:tmpl w:val="AAF6539E"/>
@@ -7456,7 +8484,156 @@
       </w:rPr>
     </w:lvl>
   </w:abstractNum>
-  <w:abstractNum w:abstractNumId="25" w15:restartNumberingAfterBreak="0">
+  <w:abstractNum w:abstractNumId="26" w15:restartNumberingAfterBreak="0">
+    <w:nsid w:val="24CD7354"/>
+    <w:multiLevelType w:val="multilevel"/>
+    <w:tmpl w:val="718C6590"/>
+    <w:lvl w:ilvl="0">
+      <w:start w:val="1"/>
+      <w:numFmt w:val="bullet"/>
+      <w:lvlText w:val=""/>
+      <w:lvlJc w:val="left"/>
+      <w:pPr>
+        <w:tabs>
+          <w:tab w:val="num" w:pos="720"/>
+        </w:tabs>
+        <w:ind w:left="720" w:hanging="360"/>
+      </w:pPr>
+      <w:rPr>
+        <w:rFonts w:ascii="Symbol" w:hAnsi="Symbol" w:hint="default"/>
+        <w:sz w:val="20"/>
+      </w:rPr>
+    </w:lvl>
+    <w:lvl w:ilvl="1" w:tentative="1">
+      <w:start w:val="1"/>
+      <w:numFmt w:val="bullet"/>
+      <w:lvlText w:val="o"/>
+      <w:lvlJc w:val="left"/>
+      <w:pPr>
+        <w:tabs>
+          <w:tab w:val="num" w:pos="1440"/>
+        </w:tabs>
+        <w:ind w:left="1440" w:hanging="360"/>
+      </w:pPr>
+      <w:rPr>
+        <w:rFonts w:ascii="Courier New" w:hAnsi="Courier New" w:hint="default"/>
+        <w:sz w:val="20"/>
+      </w:rPr>
+    </w:lvl>
+    <w:lvl w:ilvl="2" w:tentative="1">
+      <w:start w:val="1"/>
+      <w:numFmt w:val="bullet"/>
+      <w:lvlText w:val=""/>
+      <w:lvlJc w:val="left"/>
+      <w:pPr>
+        <w:tabs>
+          <w:tab w:val="num" w:pos="2160"/>
+        </w:tabs>
+        <w:ind w:left="2160" w:hanging="360"/>
+      </w:pPr>
+      <w:rPr>
+        <w:rFonts w:ascii="Wingdings" w:hAnsi="Wingdings" w:hint="default"/>
+        <w:sz w:val="20"/>
+      </w:rPr>
+    </w:lvl>
+    <w:lvl w:ilvl="3" w:tentative="1">
+      <w:start w:val="1"/>
+      <w:numFmt w:val="bullet"/>
+      <w:lvlText w:val=""/>
+      <w:lvlJc w:val="left"/>
+      <w:pPr>
+        <w:tabs>
+          <w:tab w:val="num" w:pos="2880"/>
+        </w:tabs>
+        <w:ind w:left="2880" w:hanging="360"/>
+      </w:pPr>
+      <w:rPr>
+        <w:rFonts w:ascii="Wingdings" w:hAnsi="Wingdings" w:hint="default"/>
+        <w:sz w:val="20"/>
+      </w:rPr>
+    </w:lvl>
+    <w:lvl w:ilvl="4" w:tentative="1">
+      <w:start w:val="1"/>
+      <w:numFmt w:val="bullet"/>
+      <w:lvlText w:val=""/>
+      <w:lvlJc w:val="left"/>
+      <w:pPr>
+        <w:tabs>
+          <w:tab w:val="num" w:pos="3600"/>
+        </w:tabs>
+        <w:ind w:left="3600" w:hanging="360"/>
+      </w:pPr>
+      <w:rPr>
+        <w:rFonts w:ascii="Wingdings" w:hAnsi="Wingdings" w:hint="default"/>
+        <w:sz w:val="20"/>
+      </w:rPr>
+    </w:lvl>
+    <w:lvl w:ilvl="5" w:tentative="1">
+      <w:start w:val="1"/>
+      <w:numFmt w:val="bullet"/>
+      <w:lvlText w:val=""/>
+      <w:lvlJc w:val="left"/>
+      <w:pPr>
+        <w:tabs>
+          <w:tab w:val="num" w:pos="4320"/>
+        </w:tabs>
+        <w:ind w:left="4320" w:hanging="360"/>
+      </w:pPr>
+      <w:rPr>
+        <w:rFonts w:ascii="Wingdings" w:hAnsi="Wingdings" w:hint="default"/>
+        <w:sz w:val="20"/>
+      </w:rPr>
+    </w:lvl>
+    <w:lvl w:ilvl="6" w:tentative="1">
+      <w:start w:val="1"/>
+      <w:numFmt w:val="bullet"/>
+      <w:lvlText w:val=""/>
+      <w:lvlJc w:val="left"/>
+      <w:pPr>
+        <w:tabs>
+          <w:tab w:val="num" w:pos="5040"/>
+        </w:tabs>
+        <w:ind w:left="5040" w:hanging="360"/>
+      </w:pPr>
+      <w:rPr>
+        <w:rFonts w:ascii="Wingdings" w:hAnsi="Wingdings" w:hint="default"/>
+        <w:sz w:val="20"/>
+      </w:rPr>
+    </w:lvl>
+    <w:lvl w:ilvl="7" w:tentative="1">
+      <w:start w:val="1"/>
+      <w:numFmt w:val="bullet"/>
+      <w:lvlText w:val=""/>
+      <w:lvlJc w:val="left"/>
+      <w:pPr>
+        <w:tabs>
+          <w:tab w:val="num" w:pos="5760"/>
+        </w:tabs>
+        <w:ind w:left="5760" w:hanging="360"/>
+      </w:pPr>
+      <w:rPr>
+        <w:rFonts w:ascii="Wingdings" w:hAnsi="Wingdings" w:hint="default"/>
+        <w:sz w:val="20"/>
+      </w:rPr>
+    </w:lvl>
+    <w:lvl w:ilvl="8" w:tentative="1">
+      <w:start w:val="1"/>
+      <w:numFmt w:val="bullet"/>
+      <w:lvlText w:val=""/>
+      <w:lvlJc w:val="left"/>
+      <w:pPr>
+        <w:tabs>
+          <w:tab w:val="num" w:pos="6480"/>
+        </w:tabs>
+        <w:ind w:left="6480" w:hanging="360"/>
+      </w:pPr>
+      <w:rPr>
+        <w:rFonts w:ascii="Wingdings" w:hAnsi="Wingdings" w:hint="default"/>
+        <w:sz w:val="20"/>
+      </w:rPr>
+    </w:lvl>
+  </w:abstractNum>
+  <w:abstractNum w:abstractNumId="27" w15:restartNumberingAfterBreak="0">
     <w:nsid w:val="255452CA"/>
     <w:multiLevelType w:val="multilevel"/>
     <w:tmpl w:val="BA20EDB0"/>
@@ -7605,7 +8782,7 @@
       </w:rPr>
     </w:lvl>
   </w:abstractNum>
-  <w:abstractNum w:abstractNumId="26" w15:restartNumberingAfterBreak="0">
+  <w:abstractNum w:abstractNumId="28" w15:restartNumberingAfterBreak="0">
     <w:nsid w:val="25F97552"/>
     <w:multiLevelType w:val="multilevel"/>
     <w:tmpl w:val="3CE80CD8"/>
@@ -7754,7 +8931,7 @@
       </w:rPr>
     </w:lvl>
   </w:abstractNum>
-  <w:abstractNum w:abstractNumId="27" w15:restartNumberingAfterBreak="0">
+  <w:abstractNum w:abstractNumId="29" w15:restartNumberingAfterBreak="0">
     <w:nsid w:val="26567A6D"/>
     <w:multiLevelType w:val="multilevel"/>
     <w:tmpl w:val="DF10E8D8"/>
@@ -7903,7 +9080,7 @@
       </w:rPr>
     </w:lvl>
   </w:abstractNum>
-  <w:abstractNum w:abstractNumId="28" w15:restartNumberingAfterBreak="0">
+  <w:abstractNum w:abstractNumId="30" w15:restartNumberingAfterBreak="0">
     <w:nsid w:val="283F321F"/>
     <w:multiLevelType w:val="multilevel"/>
     <w:tmpl w:val="09742C88"/>
@@ -8052,7 +9229,7 @@
       </w:rPr>
     </w:lvl>
   </w:abstractNum>
-  <w:abstractNum w:abstractNumId="29" w15:restartNumberingAfterBreak="0">
+  <w:abstractNum w:abstractNumId="31" w15:restartNumberingAfterBreak="0">
     <w:nsid w:val="28D35833"/>
     <w:multiLevelType w:val="multilevel"/>
     <w:tmpl w:val="E6A00E44"/>
@@ -8201,7 +9378,7 @@
       </w:rPr>
     </w:lvl>
   </w:abstractNum>
-  <w:abstractNum w:abstractNumId="30" w15:restartNumberingAfterBreak="0">
+  <w:abstractNum w:abstractNumId="32" w15:restartNumberingAfterBreak="0">
     <w:nsid w:val="29A60C86"/>
     <w:multiLevelType w:val="multilevel"/>
     <w:tmpl w:val="3EBE83C4"/>
@@ -8350,7 +9527,7 @@
       </w:rPr>
     </w:lvl>
   </w:abstractNum>
-  <w:abstractNum w:abstractNumId="31" w15:restartNumberingAfterBreak="0">
+  <w:abstractNum w:abstractNumId="33" w15:restartNumberingAfterBreak="0">
     <w:nsid w:val="2B576A9B"/>
     <w:multiLevelType w:val="multilevel"/>
     <w:tmpl w:val="10C6EF9A"/>
@@ -8499,7 +9676,7 @@
       </w:rPr>
     </w:lvl>
   </w:abstractNum>
-  <w:abstractNum w:abstractNumId="32" w15:restartNumberingAfterBreak="0">
+  <w:abstractNum w:abstractNumId="34" w15:restartNumberingAfterBreak="0">
     <w:nsid w:val="2BD13E81"/>
     <w:multiLevelType w:val="multilevel"/>
     <w:tmpl w:val="58F8811A"/>
@@ -8648,7 +9825,7 @@
       </w:rPr>
     </w:lvl>
   </w:abstractNum>
-  <w:abstractNum w:abstractNumId="33" w15:restartNumberingAfterBreak="0">
+  <w:abstractNum w:abstractNumId="35" w15:restartNumberingAfterBreak="0">
     <w:nsid w:val="2C905DB4"/>
     <w:multiLevelType w:val="multilevel"/>
     <w:tmpl w:val="FBB4DB60"/>
@@ -8797,7 +9974,7 @@
       </w:rPr>
     </w:lvl>
   </w:abstractNum>
-  <w:abstractNum w:abstractNumId="34" w15:restartNumberingAfterBreak="0">
+  <w:abstractNum w:abstractNumId="36" w15:restartNumberingAfterBreak="0">
     <w:nsid w:val="2CCD7456"/>
     <w:multiLevelType w:val="multilevel"/>
     <w:tmpl w:val="ACBC20C4"/>
@@ -8946,7 +10123,7 @@
       </w:rPr>
     </w:lvl>
   </w:abstractNum>
-  <w:abstractNum w:abstractNumId="35" w15:restartNumberingAfterBreak="0">
+  <w:abstractNum w:abstractNumId="37" w15:restartNumberingAfterBreak="0">
     <w:nsid w:val="2EC04484"/>
     <w:multiLevelType w:val="multilevel"/>
     <w:tmpl w:val="634A7152"/>
@@ -9095,7 +10272,7 @@
       </w:rPr>
     </w:lvl>
   </w:abstractNum>
-  <w:abstractNum w:abstractNumId="36" w15:restartNumberingAfterBreak="0">
+  <w:abstractNum w:abstractNumId="38" w15:restartNumberingAfterBreak="0">
     <w:nsid w:val="32C73575"/>
     <w:multiLevelType w:val="multilevel"/>
     <w:tmpl w:val="2E5AACE0"/>
@@ -9244,7 +10421,7 @@
       </w:rPr>
     </w:lvl>
   </w:abstractNum>
-  <w:abstractNum w:abstractNumId="37" w15:restartNumberingAfterBreak="0">
+  <w:abstractNum w:abstractNumId="39" w15:restartNumberingAfterBreak="0">
     <w:nsid w:val="33CC60D5"/>
     <w:multiLevelType w:val="multilevel"/>
     <w:tmpl w:val="42EA6586"/>
@@ -9393,7 +10570,7 @@
       </w:rPr>
     </w:lvl>
   </w:abstractNum>
-  <w:abstractNum w:abstractNumId="38" w15:restartNumberingAfterBreak="0">
+  <w:abstractNum w:abstractNumId="40" w15:restartNumberingAfterBreak="0">
     <w:nsid w:val="35652689"/>
     <w:multiLevelType w:val="multilevel"/>
     <w:tmpl w:val="F9C498AC"/>
@@ -9542,7 +10719,7 @@
       </w:rPr>
     </w:lvl>
   </w:abstractNum>
-  <w:abstractNum w:abstractNumId="39" w15:restartNumberingAfterBreak="0">
+  <w:abstractNum w:abstractNumId="41" w15:restartNumberingAfterBreak="0">
     <w:nsid w:val="3824006C"/>
     <w:multiLevelType w:val="multilevel"/>
     <w:tmpl w:val="9ADA2622"/>
@@ -9691,7 +10868,7 @@
       </w:rPr>
     </w:lvl>
   </w:abstractNum>
-  <w:abstractNum w:abstractNumId="40" w15:restartNumberingAfterBreak="0">
+  <w:abstractNum w:abstractNumId="42" w15:restartNumberingAfterBreak="0">
     <w:nsid w:val="389A3CA1"/>
     <w:multiLevelType w:val="multilevel"/>
     <w:tmpl w:val="53A2CC9A"/>
@@ -9840,7 +11017,7 @@
       </w:rPr>
     </w:lvl>
   </w:abstractNum>
-  <w:abstractNum w:abstractNumId="41" w15:restartNumberingAfterBreak="0">
+  <w:abstractNum w:abstractNumId="43" w15:restartNumberingAfterBreak="0">
     <w:nsid w:val="38AB30F6"/>
     <w:multiLevelType w:val="multilevel"/>
     <w:tmpl w:val="2B1E8538"/>
@@ -9989,7 +11166,7 @@
       </w:rPr>
     </w:lvl>
   </w:abstractNum>
-  <w:abstractNum w:abstractNumId="42" w15:restartNumberingAfterBreak="0">
+  <w:abstractNum w:abstractNumId="44" w15:restartNumberingAfterBreak="0">
     <w:nsid w:val="38F97021"/>
     <w:multiLevelType w:val="multilevel"/>
     <w:tmpl w:val="07C0CA76"/>
@@ -10138,7 +11315,7 @@
       </w:rPr>
     </w:lvl>
   </w:abstractNum>
-  <w:abstractNum w:abstractNumId="43" w15:restartNumberingAfterBreak="0">
+  <w:abstractNum w:abstractNumId="45" w15:restartNumberingAfterBreak="0">
     <w:nsid w:val="390A7CEF"/>
     <w:multiLevelType w:val="multilevel"/>
     <w:tmpl w:val="5BA2C5F6"/>
@@ -10287,7 +11464,7 @@
       </w:rPr>
     </w:lvl>
   </w:abstractNum>
-  <w:abstractNum w:abstractNumId="44" w15:restartNumberingAfterBreak="0">
+  <w:abstractNum w:abstractNumId="46" w15:restartNumberingAfterBreak="0">
     <w:nsid w:val="39CA2B99"/>
     <w:multiLevelType w:val="multilevel"/>
     <w:tmpl w:val="B5AAE4D6"/>
@@ -10436,7 +11613,7 @@
       </w:rPr>
     </w:lvl>
   </w:abstractNum>
-  <w:abstractNum w:abstractNumId="45" w15:restartNumberingAfterBreak="0">
+  <w:abstractNum w:abstractNumId="47" w15:restartNumberingAfterBreak="0">
     <w:nsid w:val="3A5F0B2D"/>
     <w:multiLevelType w:val="multilevel"/>
     <w:tmpl w:val="C56073A2"/>
@@ -10585,7 +11762,7 @@
       </w:rPr>
     </w:lvl>
   </w:abstractNum>
-  <w:abstractNum w:abstractNumId="46" w15:restartNumberingAfterBreak="0">
+  <w:abstractNum w:abstractNumId="48" w15:restartNumberingAfterBreak="0">
     <w:nsid w:val="3A9A63CE"/>
     <w:multiLevelType w:val="multilevel"/>
     <w:tmpl w:val="5EBEF834"/>
@@ -10734,7 +11911,7 @@
       </w:rPr>
     </w:lvl>
   </w:abstractNum>
-  <w:abstractNum w:abstractNumId="47" w15:restartNumberingAfterBreak="0">
+  <w:abstractNum w:abstractNumId="49" w15:restartNumberingAfterBreak="0">
     <w:nsid w:val="3C892287"/>
     <w:multiLevelType w:val="multilevel"/>
     <w:tmpl w:val="BEE035A2"/>
@@ -10883,7 +12060,7 @@
       </w:rPr>
     </w:lvl>
   </w:abstractNum>
-  <w:abstractNum w:abstractNumId="48" w15:restartNumberingAfterBreak="0">
+  <w:abstractNum w:abstractNumId="50" w15:restartNumberingAfterBreak="0">
     <w:nsid w:val="3D5F364A"/>
     <w:multiLevelType w:val="multilevel"/>
     <w:tmpl w:val="D8C6C2FA"/>
@@ -11032,7 +12209,7 @@
       </w:rPr>
     </w:lvl>
   </w:abstractNum>
-  <w:abstractNum w:abstractNumId="49" w15:restartNumberingAfterBreak="0">
+  <w:abstractNum w:abstractNumId="51" w15:restartNumberingAfterBreak="0">
     <w:nsid w:val="3F2F26A6"/>
     <w:multiLevelType w:val="multilevel"/>
     <w:tmpl w:val="D7C8C560"/>
@@ -11181,7 +12358,7 @@
       </w:rPr>
     </w:lvl>
   </w:abstractNum>
-  <w:abstractNum w:abstractNumId="50" w15:restartNumberingAfterBreak="0">
+  <w:abstractNum w:abstractNumId="52" w15:restartNumberingAfterBreak="0">
     <w:nsid w:val="3F6133FD"/>
     <w:multiLevelType w:val="multilevel"/>
     <w:tmpl w:val="4F34E824"/>
@@ -11330,7 +12507,7 @@
       </w:rPr>
     </w:lvl>
   </w:abstractNum>
-  <w:abstractNum w:abstractNumId="51" w15:restartNumberingAfterBreak="0">
+  <w:abstractNum w:abstractNumId="53" w15:restartNumberingAfterBreak="0">
     <w:nsid w:val="407631DB"/>
     <w:multiLevelType w:val="multilevel"/>
     <w:tmpl w:val="9F54061A"/>
@@ -11479,7 +12656,7 @@
       </w:rPr>
     </w:lvl>
   </w:abstractNum>
-  <w:abstractNum w:abstractNumId="52" w15:restartNumberingAfterBreak="0">
+  <w:abstractNum w:abstractNumId="54" w15:restartNumberingAfterBreak="0">
     <w:nsid w:val="45465954"/>
     <w:multiLevelType w:val="multilevel"/>
     <w:tmpl w:val="8A5207EC"/>
@@ -11628,7 +12805,7 @@
       </w:rPr>
     </w:lvl>
   </w:abstractNum>
-  <w:abstractNum w:abstractNumId="53" w15:restartNumberingAfterBreak="0">
+  <w:abstractNum w:abstractNumId="55" w15:restartNumberingAfterBreak="0">
     <w:nsid w:val="45B572DA"/>
     <w:multiLevelType w:val="multilevel"/>
     <w:tmpl w:val="A61279A4"/>
@@ -11777,7 +12954,7 @@
       </w:rPr>
     </w:lvl>
   </w:abstractNum>
-  <w:abstractNum w:abstractNumId="54" w15:restartNumberingAfterBreak="0">
+  <w:abstractNum w:abstractNumId="56" w15:restartNumberingAfterBreak="0">
     <w:nsid w:val="45BE4E8B"/>
     <w:multiLevelType w:val="multilevel"/>
     <w:tmpl w:val="DE9CA1DE"/>
@@ -11926,7 +13103,7 @@
       </w:rPr>
     </w:lvl>
   </w:abstractNum>
-  <w:abstractNum w:abstractNumId="55" w15:restartNumberingAfterBreak="0">
+  <w:abstractNum w:abstractNumId="57" w15:restartNumberingAfterBreak="0">
     <w:nsid w:val="4A72315F"/>
     <w:multiLevelType w:val="multilevel"/>
     <w:tmpl w:val="8F8EE030"/>
@@ -12075,7 +13252,7 @@
       </w:rPr>
     </w:lvl>
   </w:abstractNum>
-  <w:abstractNum w:abstractNumId="56" w15:restartNumberingAfterBreak="0">
+  <w:abstractNum w:abstractNumId="58" w15:restartNumberingAfterBreak="0">
     <w:nsid w:val="4B1F3801"/>
     <w:multiLevelType w:val="multilevel"/>
     <w:tmpl w:val="9710D5E0"/>
@@ -12224,7 +13401,7 @@
       </w:rPr>
     </w:lvl>
   </w:abstractNum>
-  <w:abstractNum w:abstractNumId="57" w15:restartNumberingAfterBreak="0">
+  <w:abstractNum w:abstractNumId="59" w15:restartNumberingAfterBreak="0">
     <w:nsid w:val="4CCD2562"/>
     <w:multiLevelType w:val="multilevel"/>
     <w:tmpl w:val="B3EE4F2C"/>
@@ -12373,7 +13550,7 @@
       </w:rPr>
     </w:lvl>
   </w:abstractNum>
-  <w:abstractNum w:abstractNumId="58" w15:restartNumberingAfterBreak="0">
+  <w:abstractNum w:abstractNumId="60" w15:restartNumberingAfterBreak="0">
     <w:nsid w:val="4F3F71F1"/>
     <w:multiLevelType w:val="multilevel"/>
     <w:tmpl w:val="EA684C7C"/>
@@ -12522,7 +13699,7 @@
       </w:rPr>
     </w:lvl>
   </w:abstractNum>
-  <w:abstractNum w:abstractNumId="59" w15:restartNumberingAfterBreak="0">
+  <w:abstractNum w:abstractNumId="61" w15:restartNumberingAfterBreak="0">
     <w:nsid w:val="50DC5231"/>
     <w:multiLevelType w:val="multilevel"/>
     <w:tmpl w:val="ED40410A"/>
@@ -12671,7 +13848,7 @@
       </w:rPr>
     </w:lvl>
   </w:abstractNum>
-  <w:abstractNum w:abstractNumId="60" w15:restartNumberingAfterBreak="0">
+  <w:abstractNum w:abstractNumId="62" w15:restartNumberingAfterBreak="0">
     <w:nsid w:val="526E11F1"/>
     <w:multiLevelType w:val="multilevel"/>
     <w:tmpl w:val="108AE314"/>
@@ -12820,7 +13997,7 @@
       </w:rPr>
     </w:lvl>
   </w:abstractNum>
-  <w:abstractNum w:abstractNumId="61" w15:restartNumberingAfterBreak="0">
+  <w:abstractNum w:abstractNumId="63" w15:restartNumberingAfterBreak="0">
     <w:nsid w:val="52845B39"/>
     <w:multiLevelType w:val="multilevel"/>
     <w:tmpl w:val="D5E42772"/>
@@ -12969,7 +14146,7 @@
       </w:rPr>
     </w:lvl>
   </w:abstractNum>
-  <w:abstractNum w:abstractNumId="62" w15:restartNumberingAfterBreak="0">
+  <w:abstractNum w:abstractNumId="64" w15:restartNumberingAfterBreak="0">
     <w:nsid w:val="53C62755"/>
     <w:multiLevelType w:val="multilevel"/>
     <w:tmpl w:val="5D9A48CE"/>
@@ -13118,7 +14295,7 @@
       </w:rPr>
     </w:lvl>
   </w:abstractNum>
-  <w:abstractNum w:abstractNumId="63" w15:restartNumberingAfterBreak="0">
+  <w:abstractNum w:abstractNumId="65" w15:restartNumberingAfterBreak="0">
     <w:nsid w:val="54255232"/>
     <w:multiLevelType w:val="multilevel"/>
     <w:tmpl w:val="367A655E"/>
@@ -13267,7 +14444,7 @@
       </w:rPr>
     </w:lvl>
   </w:abstractNum>
-  <w:abstractNum w:abstractNumId="64" w15:restartNumberingAfterBreak="0">
+  <w:abstractNum w:abstractNumId="66" w15:restartNumberingAfterBreak="0">
     <w:nsid w:val="54ED3F6F"/>
     <w:multiLevelType w:val="multilevel"/>
     <w:tmpl w:val="A5B23FEC"/>
@@ -13416,7 +14593,7 @@
       </w:rPr>
     </w:lvl>
   </w:abstractNum>
-  <w:abstractNum w:abstractNumId="65" w15:restartNumberingAfterBreak="0">
+  <w:abstractNum w:abstractNumId="67" w15:restartNumberingAfterBreak="0">
     <w:nsid w:val="54F16983"/>
     <w:multiLevelType w:val="multilevel"/>
     <w:tmpl w:val="15F4835A"/>
@@ -13565,7 +14742,7 @@
       </w:rPr>
     </w:lvl>
   </w:abstractNum>
-  <w:abstractNum w:abstractNumId="66" w15:restartNumberingAfterBreak="0">
+  <w:abstractNum w:abstractNumId="68" w15:restartNumberingAfterBreak="0">
     <w:nsid w:val="56374F23"/>
     <w:multiLevelType w:val="multilevel"/>
     <w:tmpl w:val="873EF8DE"/>
@@ -13714,7 +14891,7 @@
       </w:rPr>
     </w:lvl>
   </w:abstractNum>
-  <w:abstractNum w:abstractNumId="67" w15:restartNumberingAfterBreak="0">
+  <w:abstractNum w:abstractNumId="69" w15:restartNumberingAfterBreak="0">
     <w:nsid w:val="56926524"/>
     <w:multiLevelType w:val="multilevel"/>
     <w:tmpl w:val="BABC4EC6"/>
@@ -13863,7 +15040,7 @@
       </w:rPr>
     </w:lvl>
   </w:abstractNum>
-  <w:abstractNum w:abstractNumId="68" w15:restartNumberingAfterBreak="0">
+  <w:abstractNum w:abstractNumId="70" w15:restartNumberingAfterBreak="0">
     <w:nsid w:val="57940B79"/>
     <w:multiLevelType w:val="multilevel"/>
     <w:tmpl w:val="97226B4C"/>
@@ -14012,7 +15189,7 @@
       </w:rPr>
     </w:lvl>
   </w:abstractNum>
-  <w:abstractNum w:abstractNumId="69" w15:restartNumberingAfterBreak="0">
+  <w:abstractNum w:abstractNumId="71" w15:restartNumberingAfterBreak="0">
     <w:nsid w:val="58D64EEE"/>
     <w:multiLevelType w:val="multilevel"/>
     <w:tmpl w:val="78BE8642"/>
@@ -14161,7 +15338,7 @@
       </w:rPr>
     </w:lvl>
   </w:abstractNum>
-  <w:abstractNum w:abstractNumId="70" w15:restartNumberingAfterBreak="0">
+  <w:abstractNum w:abstractNumId="72" w15:restartNumberingAfterBreak="0">
     <w:nsid w:val="5A8A1A9B"/>
     <w:multiLevelType w:val="multilevel"/>
     <w:tmpl w:val="A852E834"/>
@@ -14310,7 +15487,7 @@
       </w:rPr>
     </w:lvl>
   </w:abstractNum>
-  <w:abstractNum w:abstractNumId="71" w15:restartNumberingAfterBreak="0">
+  <w:abstractNum w:abstractNumId="73" w15:restartNumberingAfterBreak="0">
     <w:nsid w:val="5B981843"/>
     <w:multiLevelType w:val="multilevel"/>
     <w:tmpl w:val="D3C49F4E"/>
@@ -14459,7 +15636,7 @@
       </w:rPr>
     </w:lvl>
   </w:abstractNum>
-  <w:abstractNum w:abstractNumId="72" w15:restartNumberingAfterBreak="0">
+  <w:abstractNum w:abstractNumId="74" w15:restartNumberingAfterBreak="0">
     <w:nsid w:val="5DC50725"/>
     <w:multiLevelType w:val="multilevel"/>
     <w:tmpl w:val="859E9716"/>
@@ -14608,7 +15785,7 @@
       </w:rPr>
     </w:lvl>
   </w:abstractNum>
-  <w:abstractNum w:abstractNumId="73" w15:restartNumberingAfterBreak="0">
+  <w:abstractNum w:abstractNumId="75" w15:restartNumberingAfterBreak="0">
     <w:nsid w:val="603941E4"/>
     <w:multiLevelType w:val="multilevel"/>
     <w:tmpl w:val="F92CAB5C"/>
@@ -14757,7 +15934,7 @@
       </w:rPr>
     </w:lvl>
   </w:abstractNum>
-  <w:abstractNum w:abstractNumId="74" w15:restartNumberingAfterBreak="0">
+  <w:abstractNum w:abstractNumId="76" w15:restartNumberingAfterBreak="0">
     <w:nsid w:val="60D77080"/>
     <w:multiLevelType w:val="multilevel"/>
     <w:tmpl w:val="3E80382E"/>
@@ -14906,7 +16083,7 @@
       </w:rPr>
     </w:lvl>
   </w:abstractNum>
-  <w:abstractNum w:abstractNumId="75" w15:restartNumberingAfterBreak="0">
+  <w:abstractNum w:abstractNumId="77" w15:restartNumberingAfterBreak="0">
     <w:nsid w:val="68123893"/>
     <w:multiLevelType w:val="multilevel"/>
     <w:tmpl w:val="2F60FB40"/>
@@ -15055,7 +16232,7 @@
       </w:rPr>
     </w:lvl>
   </w:abstractNum>
-  <w:abstractNum w:abstractNumId="76" w15:restartNumberingAfterBreak="0">
+  <w:abstractNum w:abstractNumId="78" w15:restartNumberingAfterBreak="0">
     <w:nsid w:val="6A6C7819"/>
     <w:multiLevelType w:val="multilevel"/>
     <w:tmpl w:val="6D468764"/>
@@ -15204,7 +16381,7 @@
       </w:rPr>
     </w:lvl>
   </w:abstractNum>
-  <w:abstractNum w:abstractNumId="77" w15:restartNumberingAfterBreak="0">
+  <w:abstractNum w:abstractNumId="79" w15:restartNumberingAfterBreak="0">
     <w:nsid w:val="6D5A6822"/>
     <w:multiLevelType w:val="multilevel"/>
     <w:tmpl w:val="63180264"/>
@@ -15353,7 +16530,7 @@
       </w:rPr>
     </w:lvl>
   </w:abstractNum>
-  <w:abstractNum w:abstractNumId="78" w15:restartNumberingAfterBreak="0">
+  <w:abstractNum w:abstractNumId="80" w15:restartNumberingAfterBreak="0">
     <w:nsid w:val="71895326"/>
     <w:multiLevelType w:val="multilevel"/>
     <w:tmpl w:val="1D628BC2"/>
@@ -15502,7 +16679,7 @@
       </w:rPr>
     </w:lvl>
   </w:abstractNum>
-  <w:abstractNum w:abstractNumId="79" w15:restartNumberingAfterBreak="0">
+  <w:abstractNum w:abstractNumId="81" w15:restartNumberingAfterBreak="0">
     <w:nsid w:val="721325B0"/>
     <w:multiLevelType w:val="multilevel"/>
     <w:tmpl w:val="20269FCE"/>
@@ -15651,7 +16828,7 @@
       </w:rPr>
     </w:lvl>
   </w:abstractNum>
-  <w:abstractNum w:abstractNumId="80" w15:restartNumberingAfterBreak="0">
+  <w:abstractNum w:abstractNumId="82" w15:restartNumberingAfterBreak="0">
     <w:nsid w:val="721733D1"/>
     <w:multiLevelType w:val="multilevel"/>
     <w:tmpl w:val="095A0898"/>
@@ -15800,7 +16977,7 @@
       </w:rPr>
     </w:lvl>
   </w:abstractNum>
-  <w:abstractNum w:abstractNumId="81" w15:restartNumberingAfterBreak="0">
+  <w:abstractNum w:abstractNumId="83" w15:restartNumberingAfterBreak="0">
     <w:nsid w:val="744E1900"/>
     <w:multiLevelType w:val="multilevel"/>
     <w:tmpl w:val="8E62B89A"/>
@@ -15949,7 +17126,7 @@
       </w:rPr>
     </w:lvl>
   </w:abstractNum>
-  <w:abstractNum w:abstractNumId="82" w15:restartNumberingAfterBreak="0">
+  <w:abstractNum w:abstractNumId="84" w15:restartNumberingAfterBreak="0">
     <w:nsid w:val="75673CA3"/>
     <w:multiLevelType w:val="multilevel"/>
     <w:tmpl w:val="E96C8144"/>
@@ -16098,7 +17275,7 @@
       </w:rPr>
     </w:lvl>
   </w:abstractNum>
-  <w:abstractNum w:abstractNumId="83" w15:restartNumberingAfterBreak="0">
+  <w:abstractNum w:abstractNumId="85" w15:restartNumberingAfterBreak="0">
     <w:nsid w:val="781D4CCA"/>
     <w:multiLevelType w:val="multilevel"/>
     <w:tmpl w:val="42284D5E"/>
@@ -16247,7 +17424,7 @@
       </w:rPr>
     </w:lvl>
   </w:abstractNum>
-  <w:abstractNum w:abstractNumId="84" w15:restartNumberingAfterBreak="0">
+  <w:abstractNum w:abstractNumId="86" w15:restartNumberingAfterBreak="0">
     <w:nsid w:val="78977E52"/>
     <w:multiLevelType w:val="multilevel"/>
     <w:tmpl w:val="E3329796"/>
@@ -16396,7 +17573,7 @@
       </w:rPr>
     </w:lvl>
   </w:abstractNum>
-  <w:abstractNum w:abstractNumId="85" w15:restartNumberingAfterBreak="0">
+  <w:abstractNum w:abstractNumId="87" w15:restartNumberingAfterBreak="0">
     <w:nsid w:val="79EB0C90"/>
     <w:multiLevelType w:val="multilevel"/>
     <w:tmpl w:val="5E8CADAC"/>
@@ -16545,7 +17722,7 @@
       </w:rPr>
     </w:lvl>
   </w:abstractNum>
-  <w:abstractNum w:abstractNumId="86" w15:restartNumberingAfterBreak="0">
+  <w:abstractNum w:abstractNumId="88" w15:restartNumberingAfterBreak="0">
     <w:nsid w:val="7C437AE1"/>
     <w:multiLevelType w:val="multilevel"/>
     <w:tmpl w:val="D284C54E"/>
@@ -16694,7 +17871,7 @@
       </w:rPr>
     </w:lvl>
   </w:abstractNum>
-  <w:abstractNum w:abstractNumId="87" w15:restartNumberingAfterBreak="0">
+  <w:abstractNum w:abstractNumId="89" w15:restartNumberingAfterBreak="0">
     <w:nsid w:val="7D0B7022"/>
     <w:multiLevelType w:val="multilevel"/>
     <w:tmpl w:val="2FD0B362"/>
@@ -16843,7 +18020,7 @@
       </w:rPr>
     </w:lvl>
   </w:abstractNum>
-  <w:abstractNum w:abstractNumId="88" w15:restartNumberingAfterBreak="0">
+  <w:abstractNum w:abstractNumId="90" w15:restartNumberingAfterBreak="0">
     <w:nsid w:val="7E960EAB"/>
     <w:multiLevelType w:val="multilevel"/>
     <w:tmpl w:val="D8FA9C64"/>
@@ -16992,7 +18169,7 @@
       </w:rPr>
     </w:lvl>
   </w:abstractNum>
-  <w:abstractNum w:abstractNumId="89" w15:restartNumberingAfterBreak="0">
+  <w:abstractNum w:abstractNumId="91" w15:restartNumberingAfterBreak="0">
     <w:nsid w:val="7EF666C3"/>
     <w:multiLevelType w:val="multilevel"/>
     <w:tmpl w:val="3AB206A8"/>
@@ -17142,52 +18319,52 @@
     </w:lvl>
   </w:abstractNum>
   <w:num w:numId="1" w16cid:durableId="347604983">
-    <w:abstractNumId w:val="53"/>
+    <w:abstractNumId w:val="55"/>
   </w:num>
   <w:num w:numId="2" w16cid:durableId="1161889438">
-    <w:abstractNumId w:val="59"/>
+    <w:abstractNumId w:val="61"/>
   </w:num>
   <w:num w:numId="3" w16cid:durableId="860164956">
     <w:abstractNumId w:val="9"/>
   </w:num>
   <w:num w:numId="4" w16cid:durableId="1216159055">
-    <w:abstractNumId w:val="73"/>
+    <w:abstractNumId w:val="75"/>
   </w:num>
   <w:num w:numId="5" w16cid:durableId="991376432">
-    <w:abstractNumId w:val="18"/>
+    <w:abstractNumId w:val="19"/>
   </w:num>
   <w:num w:numId="6" w16cid:durableId="1308782523">
-    <w:abstractNumId w:val="74"/>
+    <w:abstractNumId w:val="76"/>
   </w:num>
   <w:num w:numId="7" w16cid:durableId="1128357103">
-    <w:abstractNumId w:val="46"/>
+    <w:abstractNumId w:val="48"/>
   </w:num>
   <w:num w:numId="8" w16cid:durableId="1838229210">
-    <w:abstractNumId w:val="86"/>
+    <w:abstractNumId w:val="88"/>
   </w:num>
   <w:num w:numId="9" w16cid:durableId="1138231046">
-    <w:abstractNumId w:val="29"/>
+    <w:abstractNumId w:val="31"/>
   </w:num>
   <w:num w:numId="10" w16cid:durableId="689526630">
-    <w:abstractNumId w:val="34"/>
+    <w:abstractNumId w:val="36"/>
   </w:num>
   <w:num w:numId="11" w16cid:durableId="866913123">
-    <w:abstractNumId w:val="38"/>
+    <w:abstractNumId w:val="40"/>
   </w:num>
   <w:num w:numId="12" w16cid:durableId="634677101">
     <w:abstractNumId w:val="15"/>
   </w:num>
   <w:num w:numId="13" w16cid:durableId="1433404221">
-    <w:abstractNumId w:val="89"/>
+    <w:abstractNumId w:val="91"/>
   </w:num>
   <w:num w:numId="14" w16cid:durableId="2134443596">
-    <w:abstractNumId w:val="84"/>
+    <w:abstractNumId w:val="86"/>
   </w:num>
   <w:num w:numId="15" w16cid:durableId="1362392608">
-    <w:abstractNumId w:val="61"/>
+    <w:abstractNumId w:val="63"/>
   </w:num>
   <w:num w:numId="16" w16cid:durableId="504786420">
-    <w:abstractNumId w:val="85"/>
+    <w:abstractNumId w:val="87"/>
   </w:num>
   <w:num w:numId="17" w16cid:durableId="2754269">
     <w:abstractNumId w:val="0"/>
@@ -17196,7 +18373,7 @@
     <w:abstractNumId w:val="4"/>
   </w:num>
   <w:num w:numId="19" w16cid:durableId="1518303930">
-    <w:abstractNumId w:val="56"/>
+    <w:abstractNumId w:val="58"/>
   </w:num>
   <w:num w:numId="20" w16cid:durableId="2055351532">
     <w:abstractNumId w:val="10"/>
@@ -17205,136 +18382,136 @@
     <w:abstractNumId w:val="7"/>
   </w:num>
   <w:num w:numId="22" w16cid:durableId="165556314">
-    <w:abstractNumId w:val="80"/>
+    <w:abstractNumId w:val="82"/>
   </w:num>
   <w:num w:numId="23" w16cid:durableId="86461835">
-    <w:abstractNumId w:val="23"/>
+    <w:abstractNumId w:val="24"/>
   </w:num>
   <w:num w:numId="24" w16cid:durableId="153298722">
-    <w:abstractNumId w:val="20"/>
+    <w:abstractNumId w:val="21"/>
   </w:num>
   <w:num w:numId="25" w16cid:durableId="709458452">
-    <w:abstractNumId w:val="88"/>
+    <w:abstractNumId w:val="90"/>
   </w:num>
   <w:num w:numId="26" w16cid:durableId="306861681">
-    <w:abstractNumId w:val="26"/>
+    <w:abstractNumId w:val="28"/>
   </w:num>
   <w:num w:numId="27" w16cid:durableId="520096024">
-    <w:abstractNumId w:val="79"/>
+    <w:abstractNumId w:val="81"/>
   </w:num>
   <w:num w:numId="28" w16cid:durableId="1220019482">
-    <w:abstractNumId w:val="21"/>
+    <w:abstractNumId w:val="22"/>
   </w:num>
   <w:num w:numId="29" w16cid:durableId="1603101552">
-    <w:abstractNumId w:val="57"/>
+    <w:abstractNumId w:val="59"/>
   </w:num>
   <w:num w:numId="30" w16cid:durableId="1059478895">
-    <w:abstractNumId w:val="17"/>
+    <w:abstractNumId w:val="18"/>
   </w:num>
   <w:num w:numId="31" w16cid:durableId="1412509007">
-    <w:abstractNumId w:val="45"/>
+    <w:abstractNumId w:val="47"/>
   </w:num>
   <w:num w:numId="32" w16cid:durableId="1138569378">
     <w:abstractNumId w:val="3"/>
   </w:num>
   <w:num w:numId="33" w16cid:durableId="1294825688">
-    <w:abstractNumId w:val="22"/>
+    <w:abstractNumId w:val="23"/>
   </w:num>
   <w:num w:numId="34" w16cid:durableId="415564232">
-    <w:abstractNumId w:val="55"/>
+    <w:abstractNumId w:val="57"/>
   </w:num>
   <w:num w:numId="35" w16cid:durableId="1381242161">
-    <w:abstractNumId w:val="72"/>
+    <w:abstractNumId w:val="74"/>
   </w:num>
   <w:num w:numId="36" w16cid:durableId="1250697675">
-    <w:abstractNumId w:val="42"/>
+    <w:abstractNumId w:val="44"/>
   </w:num>
   <w:num w:numId="37" w16cid:durableId="8992653">
     <w:abstractNumId w:val="11"/>
   </w:num>
   <w:num w:numId="38" w16cid:durableId="1268542896">
-    <w:abstractNumId w:val="65"/>
+    <w:abstractNumId w:val="67"/>
   </w:num>
   <w:num w:numId="39" w16cid:durableId="489634632">
-    <w:abstractNumId w:val="41"/>
+    <w:abstractNumId w:val="43"/>
   </w:num>
   <w:num w:numId="40" w16cid:durableId="973028164">
-    <w:abstractNumId w:val="83"/>
+    <w:abstractNumId w:val="85"/>
   </w:num>
   <w:num w:numId="41" w16cid:durableId="489367536">
-    <w:abstractNumId w:val="60"/>
+    <w:abstractNumId w:val="62"/>
   </w:num>
   <w:num w:numId="42" w16cid:durableId="2130776696">
-    <w:abstractNumId w:val="77"/>
+    <w:abstractNumId w:val="79"/>
   </w:num>
   <w:num w:numId="43" w16cid:durableId="592786576">
-    <w:abstractNumId w:val="50"/>
+    <w:abstractNumId w:val="52"/>
   </w:num>
   <w:num w:numId="44" w16cid:durableId="545993622">
-    <w:abstractNumId w:val="37"/>
+    <w:abstractNumId w:val="39"/>
   </w:num>
   <w:num w:numId="45" w16cid:durableId="801577366">
-    <w:abstractNumId w:val="52"/>
+    <w:abstractNumId w:val="54"/>
   </w:num>
   <w:num w:numId="46" w16cid:durableId="1451823655">
-    <w:abstractNumId w:val="58"/>
+    <w:abstractNumId w:val="60"/>
   </w:num>
   <w:num w:numId="47" w16cid:durableId="554120890">
     <w:abstractNumId w:val="5"/>
   </w:num>
   <w:num w:numId="48" w16cid:durableId="879559900">
-    <w:abstractNumId w:val="30"/>
+    <w:abstractNumId w:val="32"/>
   </w:num>
   <w:num w:numId="49" w16cid:durableId="1442451210">
-    <w:abstractNumId w:val="33"/>
+    <w:abstractNumId w:val="35"/>
   </w:num>
   <w:num w:numId="50" w16cid:durableId="833380793">
-    <w:abstractNumId w:val="39"/>
+    <w:abstractNumId w:val="41"/>
   </w:num>
   <w:num w:numId="51" w16cid:durableId="222445353">
-    <w:abstractNumId w:val="47"/>
+    <w:abstractNumId w:val="49"/>
   </w:num>
   <w:num w:numId="52" w16cid:durableId="1648053092">
-    <w:abstractNumId w:val="70"/>
+    <w:abstractNumId w:val="72"/>
   </w:num>
   <w:num w:numId="53" w16cid:durableId="1769039085">
     <w:abstractNumId w:val="2"/>
   </w:num>
   <w:num w:numId="54" w16cid:durableId="2102022743">
-    <w:abstractNumId w:val="35"/>
+    <w:abstractNumId w:val="37"/>
   </w:num>
   <w:num w:numId="55" w16cid:durableId="8415160">
     <w:abstractNumId w:val="14"/>
   </w:num>
   <w:num w:numId="56" w16cid:durableId="2128809798">
-    <w:abstractNumId w:val="43"/>
+    <w:abstractNumId w:val="45"/>
   </w:num>
   <w:num w:numId="57" w16cid:durableId="192155370">
-    <w:abstractNumId w:val="19"/>
+    <w:abstractNumId w:val="20"/>
   </w:num>
   <w:num w:numId="58" w16cid:durableId="1154761124">
-    <w:abstractNumId w:val="62"/>
+    <w:abstractNumId w:val="64"/>
   </w:num>
   <w:num w:numId="59" w16cid:durableId="867253743">
-    <w:abstractNumId w:val="87"/>
+    <w:abstractNumId w:val="89"/>
   </w:num>
   <w:num w:numId="60" w16cid:durableId="1204171507">
-    <w:abstractNumId w:val="44"/>
+    <w:abstractNumId w:val="46"/>
   </w:num>
   <w:num w:numId="61" w16cid:durableId="2117864104">
-    <w:abstractNumId w:val="66"/>
+    <w:abstractNumId w:val="68"/>
   </w:num>
   <w:num w:numId="62" w16cid:durableId="1357534741">
-    <w:abstractNumId w:val="48"/>
+    <w:abstractNumId w:val="50"/>
   </w:num>
   <w:num w:numId="63" w16cid:durableId="1976642677">
-    <w:abstractNumId w:val="28"/>
+    <w:abstractNumId w:val="30"/>
   </w:num>
   <w:num w:numId="64" w16cid:durableId="1032608579">
-    <w:abstractNumId w:val="49"/>
+    <w:abstractNumId w:val="51"/>
   </w:num>
   <w:num w:numId="65" w16cid:durableId="457720032">
-    <w:abstractNumId w:val="63"/>
+    <w:abstractNumId w:val="65"/>
   </w:num>
   <w:num w:numId="66" w16cid:durableId="977223844">
     <w:abstractNumId w:val="8"/>
@@ -17349,49 +18526,49 @@
     <w:abstractNumId w:val="6"/>
   </w:num>
   <w:num w:numId="70" w16cid:durableId="504171244">
+    <w:abstractNumId w:val="27"/>
+  </w:num>
+  <w:num w:numId="71" w16cid:durableId="1069960696">
+    <w:abstractNumId w:val="38"/>
+  </w:num>
+  <w:num w:numId="72" w16cid:durableId="1096709223">
+    <w:abstractNumId w:val="84"/>
+  </w:num>
+  <w:num w:numId="73" w16cid:durableId="1163473357">
+    <w:abstractNumId w:val="77"/>
+  </w:num>
+  <w:num w:numId="74" w16cid:durableId="460920827">
+    <w:abstractNumId w:val="56"/>
+  </w:num>
+  <w:num w:numId="75" w16cid:durableId="837883863">
+    <w:abstractNumId w:val="29"/>
+  </w:num>
+  <w:num w:numId="76" w16cid:durableId="1150752063">
+    <w:abstractNumId w:val="69"/>
+  </w:num>
+  <w:num w:numId="77" w16cid:durableId="10376268">
+    <w:abstractNumId w:val="71"/>
+  </w:num>
+  <w:num w:numId="78" w16cid:durableId="444619485">
+    <w:abstractNumId w:val="34"/>
+  </w:num>
+  <w:num w:numId="79" w16cid:durableId="834956343">
     <w:abstractNumId w:val="25"/>
   </w:num>
-  <w:num w:numId="71" w16cid:durableId="1069960696">
-    <w:abstractNumId w:val="36"/>
-  </w:num>
-  <w:num w:numId="72" w16cid:durableId="1096709223">
-    <w:abstractNumId w:val="82"/>
-  </w:num>
-  <w:num w:numId="73" w16cid:durableId="1163473357">
-    <w:abstractNumId w:val="75"/>
-  </w:num>
-  <w:num w:numId="74" w16cid:durableId="460920827">
-    <w:abstractNumId w:val="54"/>
-  </w:num>
-  <w:num w:numId="75" w16cid:durableId="837883863">
-    <w:abstractNumId w:val="27"/>
-  </w:num>
-  <w:num w:numId="76" w16cid:durableId="1150752063">
-    <w:abstractNumId w:val="67"/>
-  </w:num>
-  <w:num w:numId="77" w16cid:durableId="10376268">
-    <w:abstractNumId w:val="69"/>
-  </w:num>
-  <w:num w:numId="78" w16cid:durableId="444619485">
-    <w:abstractNumId w:val="32"/>
-  </w:num>
-  <w:num w:numId="79" w16cid:durableId="834956343">
-    <w:abstractNumId w:val="24"/>
-  </w:num>
   <w:num w:numId="80" w16cid:durableId="683173240">
-    <w:abstractNumId w:val="51"/>
+    <w:abstractNumId w:val="53"/>
   </w:num>
   <w:num w:numId="81" w16cid:durableId="409235889">
+    <w:abstractNumId w:val="80"/>
+  </w:num>
+  <w:num w:numId="82" w16cid:durableId="1245341671">
     <w:abstractNumId w:val="78"/>
   </w:num>
-  <w:num w:numId="82" w16cid:durableId="1245341671">
-    <w:abstractNumId w:val="76"/>
-  </w:num>
   <w:num w:numId="83" w16cid:durableId="1781490870">
-    <w:abstractNumId w:val="64"/>
+    <w:abstractNumId w:val="66"/>
   </w:num>
   <w:num w:numId="84" w16cid:durableId="1055661328">
-    <w:abstractNumId w:val="81"/>
+    <w:abstractNumId w:val="83"/>
   </w:num>
   <w:num w:numId="85" w16cid:durableId="2120251477">
     <w:abstractNumId w:val="13"/>
@@ -17400,16 +18577,22 @@
     <w:abstractNumId w:val="16"/>
   </w:num>
   <w:num w:numId="87" w16cid:durableId="1892423983">
-    <w:abstractNumId w:val="68"/>
+    <w:abstractNumId w:val="70"/>
   </w:num>
   <w:num w:numId="88" w16cid:durableId="1878857451">
-    <w:abstractNumId w:val="40"/>
+    <w:abstractNumId w:val="42"/>
   </w:num>
   <w:num w:numId="89" w16cid:durableId="1175418209">
-    <w:abstractNumId w:val="31"/>
+    <w:abstractNumId w:val="33"/>
   </w:num>
   <w:num w:numId="90" w16cid:durableId="2002268385">
-    <w:abstractNumId w:val="71"/>
+    <w:abstractNumId w:val="73"/>
+  </w:num>
+  <w:num w:numId="91" w16cid:durableId="1622109431">
+    <w:abstractNumId w:val="26"/>
+  </w:num>
+  <w:num w:numId="92" w16cid:durableId="633095574">
+    <w:abstractNumId w:val="17"/>
   </w:num>
 </w:numbering>
 </file>
@@ -17814,6 +18997,7 @@
   <w:style w:type="paragraph" w:default="1" w:styleId="Normal">
     <w:name w:val="Normal"/>
     <w:qFormat/>
+    <w:rsid w:val="00A840A0"/>
   </w:style>
   <w:style w:type="paragraph" w:styleId="Heading1">
     <w:name w:val="heading 1"/>
@@ -18017,7 +19201,6 @@
   <w:style w:type="character" w:default="1" w:styleId="DefaultParagraphFont">
     <w:name w:val="Default Paragraph Font"/>
     <w:uiPriority w:val="1"/>
-    <w:semiHidden/>
     <w:unhideWhenUsed/>
   </w:style>
   <w:style w:type="table" w:default="1" w:styleId="TableNormal">

</xml_diff>